<commit_message>
docs(manuscript): apply revision improvements + surgically condense
Incorporates the reviewer/ChatGPT revision's non-destructive changes: terminology
'supply-to-demand adequacy index' -> 'capacity-to-demand index' (removes the
misleading adequacy framing), a tighter precis, a tightened Introduction paragraph 1,
and the explicit a-priori hypothesis. Then surgically condensed four of the longest
paragraphs (Introduction para 2 and the Strengths/Comparison/Operative-capacity
Discussion paragraphs) by ~25-35%, preserving every citation and every inline r
sensitivity value (mortality-sensitivity ratios, Open-Payments-inclusive ratios,
PPV proxy, operative-corroboration rates). Renders clean. The heavier revision cuts
(gutting the 8 limitations and dropping ~20 citations) were deliberately NOT applied.

Co-Authored-By: Claude Opus 4.8 <noreply@anthropic.com>
Claude-Session: https://claude.ai/code/session_01Cp6JF9dTKnqU3b8oXtz5RD
</commit_message>
<xml_diff>
--- a/manuscript/manuscript_WORKFORCE_CLIFF.docx
+++ b/manuscript/manuscript_WORKFORCE_CLIFF.docx
@@ -15,7 +15,7 @@
         <w:pStyle w:val="Date"/>
       </w:pPr>
       <w:r>
-        <w:t xml:space="preserve">July 24, 2026</w:t>
+        <w:t xml:space="preserve">July 25, 2026</w:t>
       </w:r>
     </w:p>
     <w:bookmarkStart w:id="9" w:name="abstract"/>
@@ -60,7 +60,7 @@
         <w:t xml:space="preserve"> </w:t>
       </w:r>
       <w:r>
-        <w:t xml:space="preserve">We assembled the national both-pathway URPS workforce from board certification records (the American Board of Obstetrics and Gynecology and the American Board of Urology) linked to administrative practice data, and classified clinical-practice departure from six administrative evidence streams. On the supply side, a hierarchical partial-pooled age-band departure hazard (borrowing strength from a gynecologic oncology comparator cohort; estimated over the fully observable 2016-2021 window) was applied in a dynamic age-structured projection that ages the cohort, applies age-band departure, and adds annual ACGME fellowship completers, with supply also expressed as productivity-adjusted capacity rather than head count alone. On the demand side, we projected the United States population of women aged 65 years or older (US Census Bureau 2023 National Population Projections) and the population with pelvic floor disorders (age-specific prevalence applied to those projections), and combined supply and demand into urogynecologists per 100,000 older women and a supply-to-demand adequacy index. Uncertainty was characterized by Monte Carlo parameter simulation and multidimensional one-way sensitivity analyses.</w:t>
+        <w:t xml:space="preserve">We assembled the national both-pathway URPS workforce from board certification records (the American Board of Obstetrics and Gynecology and the American Board of Urology) linked to administrative practice data, and classified clinical-practice departure from six administrative evidence streams. On the supply side, a hierarchical partial-pooled age-band departure hazard (borrowing strength from a gynecologic oncology comparator cohort; estimated over the fully observable 2016-2021 window) was applied in a dynamic age-structured projection that ages the cohort, applies age-band departure, and adds annual ACGME fellowship completers, with supply also expressed as productivity-adjusted capacity rather than head count alone. On the demand side, we projected the United States population of women aged 65 years or older (US Census Bureau 2023 National Population Projections) and the population with pelvic floor disorders (age-specific prevalence applied to those projections), and combined supply and demand into urogynecologists per 100,000 older women and a capacity-to-demand index. Uncertainty was characterized by Monte Carlo parameter simulation and multidimensional one-way sensitivity analyses.</w:t>
       </w:r>
     </w:p>
     <w:p>
@@ -114,7 +114,7 @@
         <w:pStyle w:val="FirstParagraph"/>
       </w:pPr>
       <w:r>
-        <w:t xml:space="preserve">Urogynecology and reconstructive pelvic surgery (URPS) is a board-certified subspecialty providing advanced surgical care for pelvic organ prolapse and urinary incontinence, conditions that affect nearly one in four United States women and whose burden rises steeply with age.</w:t>
+        <w:t xml:space="preserve">Urogynecology and reconstructive pelvic surgery (URPS) is a board-certified subspecialty providing advanced surgical care for pelvic organ prolapse, urinary incontinence, and other pelvic floor disorders, conditions whose prevalence increases with age and that affect nearly one in four United States women.</w:t>
       </w:r>
       <w:hyperlink w:anchor="ref-nygaard2008">
         <w:r>
@@ -129,7 +129,7 @@
         <w:t xml:space="preserve"> </w:t>
       </w:r>
       <w:r>
-        <w:t xml:space="preserve">Because pelvic floor disorders concentrate in older women, demand for urogynecologic care is coupled to demographic aging: the United States population of women aged 65 years or older is projected to grow by roughly one-third between 2025 and 2050. Whether the urogynecology workforce can meet that rising demand depends jointly on how many subspecialists enter through fellowship training and how many leave clinical practice as a small, geographically concentrated, and aging cohort retires. We therefore treat urogynecology as a supply-and-demand system, and, as a comparator subspecialty with a similar age structure and training pathway, retain board-certified gynecologic oncology, which provides definitive surgical treatment for gynecologic malignancies.</w:t>
+        <w:t xml:space="preserve">Because pelvic floor disorders concentrate in older women, demand for urogynecologic care is coupled to demographic aging: the United States population of women aged 65 years or older is projected to grow by roughly one-third between 2025 and 2050. Whether the workforce can meet that rising demand depends jointly on how many physicians enter subspecialty practice through fellowship training and how many leave clinical practice as a small, geographically concentrated, and aging cohort retires. As a comparator subspecialty with a similar age structure and training pathway, we retain board-certified gynecologic oncology, which provides definitive surgical treatment for gynecologic malignancies.</w:t>
       </w:r>
       <w:hyperlink w:anchor="ref-siegel2023">
         <w:r>
@@ -176,7 +176,7 @@
         <w:pStyle w:val="BodyText"/>
       </w:pPr>
       <w:r>
-        <w:t xml:space="preserve">As large cohorts approach retirement, departures may soon outpace the new subspecialists that fellowship programs produce. Worsening geographic access to gynecologic oncologists has been documented nationally,</w:t>
+        <w:t xml:space="preserve">As large cohorts approach retirement, departures may soon outpace the new subspecialists that fellowship programs produce. Worsening geographic access to gynecologic oncologists has been documented,</w:t>
       </w:r>
       <w:hyperlink w:anchor="ref-desjardins2023">
         <w:r>
@@ -206,7 +206,7 @@
         <w:t xml:space="preserve"> </w:t>
       </w:r>
       <w:r>
-        <w:t xml:space="preserve">and broader analyses anticipate a mismatch between an aging physician supply and rising demand,</w:t>
+        <w:t xml:space="preserve">and broader analyses anticipate a mismatch between an aging supply and rising demand across surgical subspecialties.</w:t>
       </w:r>
       <w:hyperlink w:anchor="ref-dall2013">
         <w:r>
@@ -221,45 +221,135 @@
         <w:rPr>
           <w:vertAlign w:val="superscript"/>
         </w:rPr>
+        <w:t xml:space="preserve">–</w:t>
+      </w:r>
+      <w:hyperlink w:anchor="ref-sharma2024">
+        <w:r>
+          <w:rPr>
+            <w:rStyle w:val="Hyperlink"/>
+            <w:vertAlign w:val="superscript"/>
+          </w:rPr>
+          <w:t xml:space="preserve">10</w:t>
+        </w:r>
+      </w:hyperlink>
+      <w:r>
+        <w:t xml:space="preserve"> </w:t>
+      </w:r>
+      <w:r>
+        <w:t xml:space="preserve">Existing assessments, however, typically infer departure from a single administrative signal such as Medicare billing cessation, which can misclassify low-volume subspecialists and those shifting to nonclinical roles, and rely on demographic aging without quantifying uncertainty in the timing of individual exits. Prior surgical workforce models nonetheless inform our design: demand-side models apply age-specific procedure-use rates to population projections;</w:t>
+      </w:r>
+      <w:hyperlink w:anchor="ref-etzioni2003">
+        <w:r>
+          <w:rPr>
+            <w:rStyle w:val="Hyperlink"/>
+            <w:vertAlign w:val="superscript"/>
+          </w:rPr>
+          <w:t xml:space="preserve">11</w:t>
+        </w:r>
+      </w:hyperlink>
+      <w:r>
+        <w:rPr>
+          <w:vertAlign w:val="superscript"/>
+        </w:rPr>
         <w:t xml:space="preserve">,</w:t>
       </w:r>
-      <w:hyperlink w:anchor="ref-adashi2025">
-        <w:r>
-          <w:rPr>
-            <w:rStyle w:val="Hyperlink"/>
-            <w:vertAlign w:val="superscript"/>
-          </w:rPr>
-          <w:t xml:space="preserve">9</w:t>
-        </w:r>
-      </w:hyperlink>
-      <w:r>
-        <w:t xml:space="preserve"> </w:t>
-      </w:r>
-      <w:r>
-        <w:t xml:space="preserve">a concern echoed across surgical subspecialties.</w:t>
-      </w:r>
-      <w:hyperlink w:anchor="ref-sharma2024">
-        <w:r>
-          <w:rPr>
-            <w:rStyle w:val="Hyperlink"/>
-            <w:vertAlign w:val="superscript"/>
-          </w:rPr>
-          <w:t xml:space="preserve">10</w:t>
-        </w:r>
-      </w:hyperlink>
-      <w:r>
-        <w:t xml:space="preserve"> </w:t>
-      </w:r>
-      <w:r>
-        <w:t xml:space="preserve">Existing assessments, however, typically infer departure from a single administrative signal such as Medicare billing cessation, which can misclassify low-volume subspecialists and those who shift to nonclinical roles, and rely on demographic aging or linear extrapolation without quantifying the uncertainty in the timing of individual exits. Prior surgical workforce models nonetheless offer complementary methods that inform our design: demand-side models apply age-specific procedure-use rates to population projections,</w:t>
-      </w:r>
-      <w:hyperlink w:anchor="ref-etzioni2003">
-        <w:r>
-          <w:rPr>
-            <w:rStyle w:val="Hyperlink"/>
-            <w:vertAlign w:val="superscript"/>
-          </w:rPr>
-          <w:t xml:space="preserve">11</w:t>
+      <w:hyperlink w:anchor="ref-edwards2014">
+        <w:r>
+          <w:rPr>
+            <w:rStyle w:val="Hyperlink"/>
+            <w:vertAlign w:val="superscript"/>
+          </w:rPr>
+          <w:t xml:space="preserve">12</w:t>
+        </w:r>
+      </w:hyperlink>
+      <w:r>
+        <w:t xml:space="preserve"> </w:t>
+      </w:r>
+      <w:r>
+        <w:t xml:space="preserve">dynamic stock-and-flow models age cohorts forward and can express capacity as full-time equivalents rather than head count;</w:t>
+      </w:r>
+      <w:hyperlink w:anchor="ref-fraher2013">
+        <w:r>
+          <w:rPr>
+            <w:rStyle w:val="Hyperlink"/>
+            <w:vertAlign w:val="superscript"/>
+          </w:rPr>
+          <w:t xml:space="preserve">13</w:t>
+        </w:r>
+      </w:hyperlink>
+      <w:r>
+        <w:t xml:space="preserve"> </w:t>
+      </w:r>
+      <w:r>
+        <w:t xml:space="preserve">good-practice standards emphasize explicit assumptions and quantified uncertainty;</w:t>
+      </w:r>
+      <w:hyperlink w:anchor="ref-leejt2024">
+        <w:r>
+          <w:rPr>
+            <w:rStyle w:val="Hyperlink"/>
+            <w:vertAlign w:val="superscript"/>
+          </w:rPr>
+          <w:t xml:space="preserve">14</w:t>
+        </w:r>
+      </w:hyperlink>
+      <w:r>
+        <w:t xml:space="preserve"> </w:t>
+      </w:r>
+      <w:r>
+        <w:t xml:space="preserve">and contemporary projections combining certifications, completions, and retirement find training expansion alone insufficient to offset losses.</w:t>
+      </w:r>
+      <w:hyperlink w:anchor="ref-ellison2018">
+        <w:r>
+          <w:rPr>
+            <w:rStyle w:val="Hyperlink"/>
+            <w:vertAlign w:val="superscript"/>
+          </w:rPr>
+          <w:t xml:space="preserve">15</w:t>
+        </w:r>
+      </w:hyperlink>
+      <w:r>
+        <w:t xml:space="preserve"> </w:t>
+      </w:r>
+      <w:r>
+        <w:t xml:space="preserve">Federal supply-demand modeling cannot separate the gynecologic subspecialties from generalist obstetrician-gynecologists, leaving subspecialty replacement unmeasured.</w:t>
+      </w:r>
+      <w:hyperlink w:anchor="ref-rayburn2025complexities">
+        <w:r>
+          <w:rPr>
+            <w:rStyle w:val="Hyperlink"/>
+            <w:vertAlign w:val="superscript"/>
+          </w:rPr>
+          <w:t xml:space="preserve">16</w:t>
+        </w:r>
+      </w:hyperlink>
+      <w:r>
+        <w:t xml:space="preserve"> </w:t>
+      </w:r>
+      <w:r>
+        <w:t xml:space="preserve">A single prior national projection joined urogynecology supply and demand, comparing a projected subspecialist head count with the projected number of women with pelvic floor disorders and finding a large, persistent burden per subspecialist, but it assumed retirement rather than estimating departure and counted physicians rather than clinical capacity.</w:t>
+      </w:r>
+      <w:hyperlink w:anchor="ref-brueseke2016">
+        <w:r>
+          <w:rPr>
+            <w:rStyle w:val="Hyperlink"/>
+            <w:vertAlign w:val="superscript"/>
+          </w:rPr>
+          <w:t xml:space="preserve">17</w:t>
+        </w:r>
+      </w:hyperlink>
+      <w:r>
+        <w:t xml:space="preserve"> </w:t>
+      </w:r>
+      <w:r>
+        <w:t xml:space="preserve">Because a head count alone can mislead, since it is clinical capacity, not the number of bodies, that patients experience,</w:t>
+      </w:r>
+      <w:hyperlink w:anchor="ref-stitzenberg2015">
+        <w:r>
+          <w:rPr>
+            <w:rStyle w:val="Hyperlink"/>
+            <w:vertAlign w:val="superscript"/>
+          </w:rPr>
+          <w:t xml:space="preserve">18</w:t>
         </w:r>
       </w:hyperlink>
       <w:r>
@@ -268,111 +358,6 @@
         </w:rPr>
         <w:t xml:space="preserve">,</w:t>
       </w:r>
-      <w:hyperlink w:anchor="ref-edwards2014">
-        <w:r>
-          <w:rPr>
-            <w:rStyle w:val="Hyperlink"/>
-            <w:vertAlign w:val="superscript"/>
-          </w:rPr>
-          <w:t xml:space="preserve">12</w:t>
-        </w:r>
-      </w:hyperlink>
-      <w:r>
-        <w:t xml:space="preserve"> </w:t>
-      </w:r>
-      <w:r>
-        <w:t xml:space="preserve">dynamic stock-and-flow supply models age cohorts forward annually and can express capacity as full-time equivalents rather than headcount,</w:t>
-      </w:r>
-      <w:hyperlink w:anchor="ref-fraher2013">
-        <w:r>
-          <w:rPr>
-            <w:rStyle w:val="Hyperlink"/>
-            <w:vertAlign w:val="superscript"/>
-          </w:rPr>
-          <w:t xml:space="preserve">13</w:t>
-        </w:r>
-      </w:hyperlink>
-      <w:r>
-        <w:t xml:space="preserve"> </w:t>
-      </w:r>
-      <w:r>
-        <w:t xml:space="preserve">and good-practice reporting standards emphasize explicit assumptions and quantified uncertainty.</w:t>
-      </w:r>
-      <w:hyperlink w:anchor="ref-leejt2024">
-        <w:r>
-          <w:rPr>
-            <w:rStyle w:val="Hyperlink"/>
-            <w:vertAlign w:val="superscript"/>
-          </w:rPr>
-          <w:t xml:space="preserve">14</w:t>
-        </w:r>
-      </w:hyperlink>
-      <w:r>
-        <w:t xml:space="preserve"> </w:t>
-      </w:r>
-      <w:r>
-        <w:t xml:space="preserve">Contemporary surgical projections that combine board certifications, residency completions, and retirement have likewise found that training expansion alone is insufficient to offset losses,</w:t>
-      </w:r>
-      <w:hyperlink w:anchor="ref-ellison2018">
-        <w:r>
-          <w:rPr>
-            <w:rStyle w:val="Hyperlink"/>
-            <w:vertAlign w:val="superscript"/>
-          </w:rPr>
-          <w:t xml:space="preserve">15</w:t>
-        </w:r>
-      </w:hyperlink>
-      <w:r>
-        <w:t xml:space="preserve"> </w:t>
-      </w:r>
-      <w:r>
-        <w:t xml:space="preserve">a pattern our subspecialty-specific, uncertainty-quantified model tests directly against graduate output. Federal supply-demand modeling, moreover, cannot separate the gynecologic subspecialties from generalist obstetrician-gynecologists, leaving subspecialty replacement unmeasured.</w:t>
-      </w:r>
-      <w:hyperlink w:anchor="ref-rayburn2025complexities">
-        <w:r>
-          <w:rPr>
-            <w:rStyle w:val="Hyperlink"/>
-            <w:vertAlign w:val="superscript"/>
-          </w:rPr>
-          <w:t xml:space="preserve">16</w:t>
-        </w:r>
-      </w:hyperlink>
-      <w:r>
-        <w:t xml:space="preserve"> </w:t>
-      </w:r>
-      <w:r>
-        <w:t xml:space="preserve">A single prior national projection has joined urogynecology supply and demand, comparing a projected subspecialist head count with the projected number of women with pelvic floor disorders and finding a large and persistent burden per subspecialist; it assumed retirement rather than estimating departure, counted physicians rather than clinical capacity, and treated providers and patients as nationally interchangeable.</w:t>
-      </w:r>
-      <w:hyperlink w:anchor="ref-brueseke2016">
-        <w:r>
-          <w:rPr>
-            <w:rStyle w:val="Hyperlink"/>
-            <w:vertAlign w:val="superscript"/>
-          </w:rPr>
-          <w:t xml:space="preserve">17</w:t>
-        </w:r>
-      </w:hyperlink>
-      <w:r>
-        <w:t xml:space="preserve"> </w:t>
-      </w:r>
-      <w:r>
-        <w:t xml:space="preserve">Other assessments have generally counted certified physicians or society members at a single point in time, and workforce studies have argued that a head count alone can mislead, because it is clinical capacity, not the number of bodies, that patients experience.</w:t>
-      </w:r>
-      <w:hyperlink w:anchor="ref-stitzenberg2015">
-        <w:r>
-          <w:rPr>
-            <w:rStyle w:val="Hyperlink"/>
-            <w:vertAlign w:val="superscript"/>
-          </w:rPr>
-          <w:t xml:space="preserve">18</w:t>
-        </w:r>
-      </w:hyperlink>
-      <w:r>
-        <w:rPr>
-          <w:vertAlign w:val="superscript"/>
-        </w:rPr>
-        <w:t xml:space="preserve">,</w:t>
-      </w:r>
       <w:hyperlink w:anchor="ref-temkin2022fte">
         <w:r>
           <w:rPr>
@@ -386,7 +371,7 @@
         <w:t xml:space="preserve"> </w:t>
       </w:r>
       <w:r>
-        <w:t xml:space="preserve">We build on that prior supply-and-demand projection by estimating departure empirically from six administrative streams, counting an active both-pathway roster validated by billing, expressing supply as productivity-adjusted capacity, and quantifying uncertainty in the balance. Whether the anticipated shortage is a near-term problem of aggregate supply, rather than of the distribution of a growing but geographically concentrated workforce, has not been tested against actual graduate output and explicit demand; we provide that test.</w:t>
+        <w:t xml:space="preserve">we build on that projection by estimating departure empirically from six administrative streams, counting an active both-pathway roster validated by billing, expressing supply as productivity-adjusted capacity, and quantifying uncertainty. Whether the anticipated shortage is a near-term problem of aggregate supply rather than of the distribution of a growing but geographically concentrated workforce has not been tested against actual graduate output and explicit demand; we provide that test.</w:t>
       </w:r>
     </w:p>
     <w:p>
@@ -394,7 +379,7 @@
         <w:pStyle w:val="BodyText"/>
       </w:pPr>
       <w:r>
-        <w:t xml:space="preserve">To address these gaps, we assembled the national United States both-pathway urogynecology workforce (the obstetrics-gynecology and urology certifying pathways), with gynecologic oncology (GO) as a comparator, restricted each to physicians in active clinical practice, and classified clinical-practice departure using a framework that integrated six administrative evidence streams. On the supply side, we projected each active workforce with a dynamic age-structured model driven by an empirically estimated age-band departure hazard and ACGME fellowship completions, and expressed supply as productivity-adjusted capacity as well as head count. On the demand side, we projected the population of older United States women and the population with pelvic floor disorders through 2050, and combined supply with demand into per-capita coverage and a supply-to-demand adequacy index. This analysis addresses national aggregate supply and demand; it does not resolve geographic distribution, effective operative capacity, or whether aggregate adequacy is realized in any local market.</w:t>
+        <w:t xml:space="preserve">To address these gaps, we assembled the national United States both-pathway urogynecology workforce (the obstetrics-gynecology and urology certifying pathways), with gynecologic oncology (GO) as a comparator, restricted each to physicians in active clinical practice, and classified clinical-practice departure using a framework that integrated six administrative evidence streams. On the supply side, we projected each active workforce with a dynamic age-structured model driven by an empirically estimated age-band departure hazard and ACGME fellowship completions, and expressed supply as productivity-adjusted capacity as well as head count. On the demand side, we projected the population of older United States women and the population with pelvic floor disorders through 2050, and combined supply with demand into per-capita coverage and a capacity-to-demand index. This analysis addresses national aggregate supply and demand; it does not resolve geographic distribution, effective operative capacity, or whether aggregate adequacy is realized in any local market. We hypothesized that recent fellowship output would replace near-term departures but that demographic growth would reduce per-capita coverage.</w:t>
       </w:r>
     </w:p>
     <w:bookmarkEnd w:id="10"/>
@@ -1037,13 +1022,13 @@
       </w:r>
     </w:p>
     <w:bookmarkEnd w:id="21"/>
-    <w:bookmarkStart w:id="22" w:name="X760ef0c124fe9f37cb5d71b8ee176e3e2334cca"/>
+    <w:bookmarkStart w:id="22" w:name="X3e0bf0ac78deb62d4aafec2ce489ff7f4f685fb"/>
     <w:p>
       <w:pPr>
         <w:pStyle w:val="Heading2"/>
       </w:pPr>
       <w:r>
-        <w:t xml:space="preserve">Demand Estimation and Supply-to-Demand Adequacy</w:t>
+        <w:t xml:space="preserve">Demand Estimation and Capacity Relative to Demographic Demand</w:t>
       </w:r>
     </w:p>
     <w:p>
@@ -1089,7 +1074,7 @@
         <w:t xml:space="preserve"> </w:t>
       </w:r>
       <w:r>
-        <w:t xml:space="preserve">so that a supply-to-demand adequacy index (capacity relative to 2025 demand) reflects delivered care rather than the number of certified physicians; the urology-pathway contribution to that capacity is varied in sensitivity analysis. The supply trajectory carried the same entrant and empirically estimated departure inputs as the primary projection, extended from the fully modeled 2025-2029 horizon to 2050 to align with the demographic-demand horizon. Because that extension projects a 2016-2021 departure hazard and recent graduate output far beyond the calibrated window, the long-horizon supply-and-demand estimates are provisional and are reported to frame supply against demand, not as validated forecasts of clinical need. An interactive version of this supply-to-demand model, in which the productivity and pathway assumptions can be varied, accompanies the manuscript.</w:t>
+        <w:t xml:space="preserve">so that a capacity-to-demand index (capacity relative to 2025 demand) reflects delivered care rather than the number of certified physicians; the urology-pathway contribution to that capacity is varied in sensitivity analysis. The supply trajectory carried the same entrant and empirically estimated departure inputs as the primary projection, extended from the fully modeled 2025-2029 horizon to 2050 to align with the demographic-demand horizon. Because that extension projects a 2016-2021 departure hazard and recent graduate output far beyond the calibrated window, the long-horizon supply-and-demand estimates are provisional and are reported to frame supply against demand, not as validated forecasts of clinical need. An interactive version of this supply-to-demand model, in which the productivity and pathway assumptions can be varied, accompanies the manuscript.</w:t>
       </w:r>
     </w:p>
     <w:bookmarkEnd w:id="22"/>
@@ -1692,7 +1677,7 @@
               <a:graphicData uri="http://schemas.openxmlformats.org/drawingml/2006/picture">
                 <pic:pic>
                   <pic:nvPicPr>
-                    <pic:cNvPr descr="manuscript_WORKFORCE_CLIFF_files/figures/figure1-1.png" id="28" name="Picture"/>
+                    <pic:cNvPr descr="/Users/tylermuffly/Library/Caches/claude-code-tmp/claude-501/-Users-tylermuffly-isochrones/5b8acb2f-8ebf-4a3f-b93c-042bbf0bc68c/scratchpad/cliff-clone/manuscript/manuscript_WORKFORCE_CLIFF_files/figures/figure1-1.png" id="28" name="Picture"/>
                     <pic:cNvPicPr>
                       <a:picLocks noChangeArrowheads="1" noChangeAspect="1"/>
                     </pic:cNvPicPr>
@@ -1773,7 +1758,7 @@
               <a:graphicData uri="http://schemas.openxmlformats.org/drawingml/2006/picture">
                 <pic:pic>
                   <pic:nvPicPr>
-                    <pic:cNvPr descr="manuscript_WORKFORCE_CLIFF_files/figures/figure2-1.png" id="31" name="Picture"/>
+                    <pic:cNvPr descr="/Users/tylermuffly/Library/Caches/claude-code-tmp/claude-501/-Users-tylermuffly-isochrones/5b8acb2f-8ebf-4a3f-b93c-042bbf0bc68c/scratchpad/cliff-clone/manuscript/manuscript_WORKFORCE_CLIFF_files/figures/figure2-1.png" id="31" name="Picture"/>
                     <pic:cNvPicPr>
                       <a:picLocks noChangeArrowheads="1" noChangeAspect="1"/>
                     </pic:cNvPicPr>
@@ -1918,7 +1903,7 @@
         <w:pStyle w:val="FirstParagraph"/>
       </w:pPr>
       <w:r>
-        <w:t xml:space="preserve">Set against the population it serves, projected urogynecology supply outpaced demographic demand across the 2025-2050 horizon (accompanying supply-to-demand model). The population of United States women aged 65 years or older, in whom pelvic floor disorders concentrate, was projected to rise about 29% (from 34.7 to 44.8 million) and the population living with a pelvic floor disorder about 19% (from 33.1 to 39.5 million), while the projected workforce grew faster, by about 79% (index 179, 2025 = 100). As a result, urogynecologists per 100,000 women aged 65 years or older rose from 3.9 in 2025 to about 5.4 in 2050, and the number of women with a pelvic floor disorder per urogynecologist fell from roughly 24,800 to 16,500. Expressed as productivity-adjusted capacity rather than head count, the supply-to-demand adequacy index rose above its 2025 value across the horizon and remained above one under the base-case urology-pathway contribution; because supply grew from a larger proportional base than demand, that ordering was preserved across the plausible range of productivity and pathway assumptions examined in sensitivity analysis. These supply-and-demand estimates are national aggregates under stable prevalence and care-seeking and rest on a long-horizon extrapolation of the departure hazard; they indicate whether the number and capacity of urogynecologists keeps pace with a growing older-female population, not whether that capacity reaches the markets or procedures where demand is concentrated.</w:t>
+        <w:t xml:space="preserve">Set against the population it serves, projected urogynecology supply outpaced demographic demand across the 2025-2050 horizon (accompanying supply-to-demand model). The population of United States women aged 65 years or older, in whom pelvic floor disorders concentrate, was projected to rise about 29% (from 34.7 to 44.8 million) and the population living with a pelvic floor disorder about 19% (from 33.1 to 39.5 million), while the projected workforce grew faster, by about 79% (index 179, 2025 = 100). As a result, urogynecologists per 100,000 women aged 65 years or older rose from 3.9 in 2025 to about 5.4 in 2050, and the number of women with a pelvic floor disorder per urogynecologist fell from roughly 24,800 to 16,500. Expressed as productivity-adjusted capacity rather than head count, the capacity-to-demand index rose above its 2025 value across the horizon and remained above one under the base-case urology-pathway contribution; because supply grew from a larger proportional base than demand, that ordering was preserved across the plausible range of productivity and pathway assumptions examined in sensitivity analysis. These supply-and-demand estimates are national aggregates under stable prevalence and care-seeking and rest on a long-horizon extrapolation of the departure hazard; they indicate whether the number and capacity of urogynecologists keeps pace with a growing older-female population, not whether that capacity reaches the markets or procedures where demand is concentrated.</w:t>
       </w:r>
     </w:p>
     <w:bookmarkEnd w:id="34"/>
@@ -1990,7 +1975,7 @@
         <w:pStyle w:val="FirstParagraph"/>
       </w:pPr>
       <w:r>
-        <w:t xml:space="preserve">Whether headcount replacement implies replacement of operative capacity is a distinct and clinically important question that our data could not resolve. An exploratory Medicare fee-for-service analysis found that most apparent operative cessations were not accompanied by complete clinical-practice departure (only 7% to 18% coincided with an independent departure signal, and most physicians kept billing clinically), and that estimates of graduate operative entry depended heavily on follow-up length; because a true operative retiree may keep billing clinic visits, these signals could not separate genuine cessation of surgery from loss of Medicare visibility, and once the follow-up artifact was addressed the corrected replacement estimates were above one but too unreliable to interpret.</w:t>
+        <w:t xml:space="preserve">Whether head-count replacement implies replacement of operative capacity is a distinct question our data could not resolve. An exploratory Medicare fee-for-service analysis found that most apparent operative cessations were not accompanied by complete clinical-practice departure (only 7% to 18% coincided with an independent departure signal), and estimates of graduate operative entry depended heavily on follow-up length; because a true operative retiree may keep billing clinic visits, these signals could not separate genuine cessation of surgery from loss of Medicare visibility.</w:t>
       </w:r>
       <w:hyperlink w:anchor="ref-poushay2018">
         <w:r>
@@ -2035,7 +2020,7 @@
         <w:t xml:space="preserve"> </w:t>
       </w:r>
       <w:r>
-        <w:t xml:space="preserve">Because Medicare fee-for-service omits the commercial and facility-billed surgery that constitutes much of these subspecialties’ operative volume, operative-capacity replacement remains unresolved and will require all-payer claims or institutional operative-log data to measure directly. The conceptual point stands regardless: because a surgeon can leave operative practice while remaining clinically active, adequate headcount does not by itself guarantee adequate surgical capacity, and this distinction should be measured directly rather than assumed in future workforce studies.</w:t>
+        <w:t xml:space="preserve">Because Medicare fee-for-service omits the commercial and facility-billed surgery that constitutes much of these subspecialties’ operative volume, operative-capacity replacement remains unresolved and will require all-payer or institutional operative-log data. The conceptual point stands: because a surgeon can leave operative practice while remaining clinically active, adequate head count does not guarantee adequate surgical capacity, and this distinction should be measured rather than assumed.</w:t>
       </w:r>
     </w:p>
     <w:bookmarkEnd w:id="38"/>
@@ -2053,7 +2038,7 @@
         <w:pStyle w:val="FirstParagraph"/>
       </w:pPr>
       <w:r>
-        <w:t xml:space="preserve">Our findings agree with and extend the most recent gynecologic oncology fellowship analysis. Holtzman and colleagues documented gynecologic oncology fellowship programs rising from 38 to 65 and annual positions from 36 to 80 between 2004 and 2023, alongside geographic maldistribution;</w:t>
+        <w:t xml:space="preserve">Our findings extend the most recent gynecologic oncology fellowship analysis: Holtzman and colleagues documented programs rising from 38 to 65 and annual positions from 36 to 80 between 2004 and 2023, alongside geographic maldistribution;</w:t>
       </w:r>
       <w:hyperlink w:anchor="ref-holtzman2025">
         <w:r>
@@ -2068,7 +2053,7 @@
         <w:t xml:space="preserve"> </w:t>
       </w:r>
       <w:r>
-        <w:t xml:space="preserve">our completion-to-departure ratio of 7.1 quantifies the imbalance between fellowship inflow and clinical-practice outflow that underlies their observation, and extends their program-and-position accounting by measuring actual graduate output against empirically estimated departures. Earlier need-based projections from demographic aging did not measure actual graduate output,</w:t>
+        <w:t xml:space="preserve">our completion-to-departure ratio of 7.1 quantifies the inflow-outflow imbalance underlying that observation by measuring actual graduate output against empirically estimated departures. Earlier need-based projections did not measure graduate output,</w:t>
       </w:r>
       <w:hyperlink w:anchor="ref-wallace2010">
         <w:r>
@@ -2083,7 +2068,7 @@
         <w:t xml:space="preserve"> </w:t>
       </w:r>
       <w:r>
-        <w:t xml:space="preserve">which we find substantially exceeds program-capacity assumptions; documented worsening geographic access to gynecologic oncologists</w:t>
+        <w:t xml:space="preserve">which we find substantially exceeds program-capacity assumptions, so documented worsening access to gynecologic oncologists</w:t>
       </w:r>
       <w:hyperlink w:anchor="ref-desjardins2023">
         <w:r>
@@ -2098,7 +2083,7 @@
         <w:t xml:space="preserve"> </w:t>
       </w:r>
       <w:r>
-        <w:t xml:space="preserve">therefore cannot be attributed to a near-term national headcount replacement failure alone. For urogynecology specifically, the single prior national projection to join supply and demand, Brueseke and colleagues, projected the subspecialist head count against the projected number of women with pelvic floor disorders and reported roughly 27,650 women with a pelvic floor disorder per subspecialist by 2045, establishing that a rising head count does not erase the underlying disease burden.</w:t>
+        <w:t xml:space="preserve">cannot be attributed to near-term national head-count replacement failure alone. For urogynecology, the single prior national supply-and-demand projection reported roughly 27,650 women with a pelvic floor disorder per subspecialist by 2045, establishing that a rising head count does not erase the disease burden.</w:t>
       </w:r>
       <w:hyperlink w:anchor="ref-brueseke2016">
         <w:r>
@@ -2113,7 +2098,7 @@
         <w:t xml:space="preserve"> </w:t>
       </w:r>
       <w:r>
-        <w:t xml:space="preserve">We advance that analysis on four fronts. First, we estimate departure empirically from six administrative streams rather than assuming retirement at a fixed age, and we quantify the resulting uncertainty. Second, we count an active, both-pathway roster validated by Medicare billing rather than a certification or society-membership head count, and prior society-membership frames can undercount the urology pathway that also delivers pelvic floor care.</w:t>
+        <w:t xml:space="preserve">We advance that analysis by estimating departure empirically from six administrative streams with quantified uncertainty rather than assuming fixed-age retirement; counting an active both-pathway roster validated by Medicare billing rather than a certification or society-membership head count that can undercount the urology pathway;</w:t>
       </w:r>
       <w:hyperlink w:anchor="ref-wallace2010">
         <w:r>
@@ -2128,7 +2113,7 @@
         <w:t xml:space="preserve"> </w:t>
       </w:r>
       <w:r>
-        <w:t xml:space="preserve">Third, we express supply as productivity-adjusted capacity rather than head count, following the principle that clinical capacity, not the number of bodies, is what patients experience.</w:t>
+        <w:t xml:space="preserve">expressing supply as productivity-adjusted capacity, since clinical capacity, not the number of bodies, is what patients experience;</w:t>
       </w:r>
       <w:hyperlink w:anchor="ref-stitzenberg2015">
         <w:r>
@@ -2158,7 +2143,7 @@
         <w:t xml:space="preserve"> </w:t>
       </w:r>
       <w:r>
-        <w:t xml:space="preserve">Fourth, we report the balance as per-capita coverage rather than a single ratio. Because the demand denominator (women with any modeled pelvic floor disorder) is an upper-bound epidemiologic construct rather than a count of subspecialty visits or operations,</w:t>
+        <w:t xml:space="preserve">and reporting per-capita coverage rather than a single ratio. Because the demand denominator (women with any modeled pelvic floor disorder) is an upper-bound epidemiologic construct rather than a count of visits or operations,</w:t>
       </w:r>
       <w:hyperlink w:anchor="ref-nygaard2008">
         <w:r>
@@ -2173,7 +2158,7 @@
         <w:t xml:space="preserve"> </w:t>
       </w:r>
       <w:r>
-        <w:t xml:space="preserve">we present coverage as relative and do not interpret it as a proportion of clinical need met; consultation-based and surgical-volume demand models are informative alternative denominators for future work.</w:t>
+        <w:t xml:space="preserve">we present coverage as relative and do not interpret it as the proportion of clinical need met.</w:t>
       </w:r>
     </w:p>
     <w:p>
@@ -2393,7 +2378,7 @@
         <w:pStyle w:val="FirstParagraph"/>
       </w:pPr>
       <w:r>
-        <w:t xml:space="preserve">This analysis combines primary-source workforce and fellowship data with explicit administrative-classification and modeling assumptions: the active workforce from certification records linked to administrative data, graduate counts from ACGME completion records, and departure rates estimated empirically over a right-censoring-safe window, matching a national surgeon-attrition benchmark from the same data.</w:t>
+        <w:t xml:space="preserve">This analysis combines primary-source workforce and fellowship data with explicit administrative-classification assumptions: an active workforce from certification records linked to administrative data, ACGME graduate counts, and departure rates estimated empirically over a right-censoring-safe window, matching a national surgeon-attrition benchmark from the same data.</w:t>
       </w:r>
       <w:hyperlink w:anchor="ref-elemosho2026">
         <w:r>
@@ -2408,7 +2393,7 @@
         <w:t xml:space="preserve"> </w:t>
       </w:r>
       <w:r>
-        <w:t xml:space="preserve">The multi-source classifier integrates certification, industry payments, prescribing, enrollment, and claims signals rather than a single source such as Medicare billing cessation, intended to reduce reliance on any single source and the associated risk of misclassifying, for example, a low-volume subspecialist who stops billing Medicare but keeps operating. We assessed aggregate temporal calibration by back-testing (Appendix S3), which reproduced observed active headcount within about 1% but does not validate individual departure classifications, and we checked the classifier for concordance against independent state-licensure status: it agreed with licensure on active status (negative predictive value 0.98) but flagged more departures than licensure recorded (about 11% versus 3%; Cohen kappa 0.06), as expected because physicians retain licenses after leaving practice. At the detection stage the classifier was disproportionately driven by cessation of Open Payments reporting (the sole firing source for about 30% of detected departures); because stopping industry payments is not a validated indicator of leaving practice, the primary definition requires a corroborating non-Open-Payments anchor (Medicare Part B cessation, Part D cessation, NPPES deactivation, or ABMS lapse), which removes the Open-Payments-only events. We do not assert which definition is closer to truth pending the individual adjudication; we report only that the finding is stable across the choice. Under the Open Payments-inclusive definition the ratios were lower (about 5.6 for Gynecologic Oncology and 4.3 for URPS) and under the primary non-Open-Payments-anchored definition higher, but both cohorts remained above replacement under every source-inclusion rule tested (Appendix S15); the non-Open-Payments-anchored definition also raised the estimated median departure age. Because the primary outcome is departure, not active status, a high negative predictive value does not establish the positive predictive value or sensitivity of a classified departure. Automated corroboration cannot fill this gap: within the Open-Payments-inclusive detection layer a non-Open-Payments signal supported 36% (Gynecologic Oncology) and 46% (URPS) of detected departures (Appendix S7b), but the primary non-Open-Payments-anchored endpoint retains only the events that carry such an anchor, so 100% are corroborated by construction, a tautology rather than validation. Genuine individual-level validation requires the prespecified two-reviewer chart adjudication, whose sample and instrument are complete but whose results are pending (Appendix S7); until it is complete we do not claim the departure classifier is individually validated and report the endpoint as provisional. Death was under-ascertained by both administrative systems, and because the obituary-confirmation pipeline could not be completed, board-confirmed deaths were not individually folded into the departure hazard or the active baseline; missed deaths leave deceased physicians in the active stock and drop true departure events from the numerator, biasing the departure rate downward and the completion-to-departure ratio upward. To bound this bias we applied an age- and sex-specific expected-mortality sensitivity (SSA Period Life Table, 2020; Appendix S25), adding expected deaths to the departure numerator; because general-population mortality overstates mortality among practicing physicians, attributing every expected death to a missed departure is a conservative upper bound. Even under that upper bound the ratios fell only to 4.3 for Gynecologic Oncology and 3.3 for URPS (and to 5.3 and 4.2 respectively if half the expected deaths were missed), both remaining above replacement.</w:t>
+        <w:t xml:space="preserve">The multi-source classifier integrates certification, industry-payment, prescribing, enrollment, and claims signals rather than a single source, reducing the risk of misclassifying a low-volume subspecialist who stops billing Medicare but keeps operating. Back-testing reproduced observed active head count within about 1% (Appendix S3) but does not validate individual classifications; the classifier agreed with state licensure on active status (negative predictive value 0.98) yet flagged more departures than licensure recorded (about 11% versus 3%; Cohen kappa 0.06), as expected because physicians retain licenses after leaving practice. Because cessation of Open Payments reporting (the sole firing source for about 30% of detected departures) is not a validated indicator of leaving practice, the primary definition requires a corroborating non-Open-Payments anchor (Medicare Part B or Part D cessation, NPPES deactivation, or ABMS lapse); under the Open Payments-inclusive definition the ratios were lower (about 5.6 for Gynecologic Oncology and 4.3 for URPS) and under the primary definition higher, but both cohorts remained above replacement under every source-inclusion rule (Appendix S15). Because the primary outcome is departure, not active status, a high negative predictive value does not establish positive predictive value or sensitivity, and automated corroboration cannot fill the gap: within the Open-Payments-inclusive layer a non-Open-Payments signal supported 36% (Gynecologic Oncology) and 46% (URPS) of detected departures (Appendix S7b), but the anchored endpoint retains only events carrying such an anchor, so 100% are corroborated by construction, a tautology rather than validation. Genuine validation requires the prespecified two-reviewer chart adjudication, complete but pending (Appendix S7), so we report the endpoint as provisional. Death was under-ascertained by both systems; missed deaths leave deceased physicians in the active stock and bias the departure rate downward. To bound this we added age- and sex-specific expected deaths to the departure numerator (SSA Period Life Table, 2020; Appendix S25), a conservative upper bound because general-population mortality overstates physician mortality. Even so the ratios fell only to 4.3 for Gynecologic Oncology and 3.3 for URPS (5.3 and 4.2 if half were missed), both above replacement.</w:t>
       </w:r>
     </w:p>
     <w:bookmarkEnd w:id="42"/>

</xml_diff>

<commit_message>
docs(cliff): embed workforce + sensitivity figures in README; regenerate figures/docx
README now shows the abstract projection figure, the scenario-comparison pair,
and the retirement-detection-threshold sensitivity sweep with captions.
Regenerated retirement_sensitivity_change figures and the manuscript .docx.

Co-Authored-By: Claude Opus 4.8 <noreply@anthropic.com>
Claude-Session: https://claude.ai/code/session_01Cp6JF9dTKnqU3b8oXtz5RD
</commit_message>
<xml_diff>
--- a/manuscript/manuscript_WORKFORCE_CLIFF.docx
+++ b/manuscript/manuscript_WORKFORCE_CLIFF.docx
@@ -15,7 +15,7 @@
         <w:pStyle w:val="Date"/>
       </w:pPr>
       <w:r>
-        <w:t xml:space="preserve">July 25, 2026</w:t>
+        <w:t xml:space="preserve">July 28, 2026</w:t>
       </w:r>
     </w:p>
     <w:bookmarkStart w:id="9" w:name="abstract"/>
@@ -1677,7 +1677,7 @@
               <a:graphicData uri="http://schemas.openxmlformats.org/drawingml/2006/picture">
                 <pic:pic>
                   <pic:nvPicPr>
-                    <pic:cNvPr descr="/Users/tylermuffly/Library/Caches/claude-code-tmp/claude-501/-Users-tylermuffly-isochrones/5b8acb2f-8ebf-4a3f-b93c-042bbf0bc68c/scratchpad/cliff-clone/manuscript/manuscript_WORKFORCE_CLIFF_files/figures/figure1-1.png" id="28" name="Picture"/>
+                    <pic:cNvPr descr="/Users/tylermuffly/cliff/manuscript/manuscript_WORKFORCE_CLIFF_files/figures/figure1-1.png" id="28" name="Picture"/>
                     <pic:cNvPicPr>
                       <a:picLocks noChangeArrowheads="1" noChangeAspect="1"/>
                     </pic:cNvPicPr>
@@ -1758,7 +1758,7 @@
               <a:graphicData uri="http://schemas.openxmlformats.org/drawingml/2006/picture">
                 <pic:pic>
                   <pic:nvPicPr>
-                    <pic:cNvPr descr="/Users/tylermuffly/Library/Caches/claude-code-tmp/claude-501/-Users-tylermuffly-isochrones/5b8acb2f-8ebf-4a3f-b93c-042bbf0bc68c/scratchpad/cliff-clone/manuscript/manuscript_WORKFORCE_CLIFF_files/figures/figure2-1.png" id="31" name="Picture"/>
+                    <pic:cNvPr descr="/Users/tylermuffly/cliff/manuscript/manuscript_WORKFORCE_CLIFF_files/figures/figure2-1.png" id="31" name="Picture"/>
                     <pic:cNvPicPr>
                       <a:picLocks noChangeArrowheads="1" noChangeAspect="1"/>
                     </pic:cNvPicPr>
@@ -2378,7 +2378,7 @@
         <w:pStyle w:val="FirstParagraph"/>
       </w:pPr>
       <w:r>
-        <w:t xml:space="preserve">This analysis combines primary-source workforce and fellowship data with explicit administrative-classification assumptions: an active workforce from certification records linked to administrative data, ACGME graduate counts, and departure rates estimated empirically over a right-censoring-safe window, matching a national surgeon-attrition benchmark from the same data.</w:t>
+        <w:t xml:space="preserve">This analysis combines primary-source workforce and fellowship data with explicit administrative-classification and modeling assumptions: an active workforce from certification records linked to administrative data, ACGME graduate counts, and departure rates estimated empirically over a right-censoring-safe window, matching a national surgeon-attrition benchmark from the same data.</w:t>
       </w:r>
       <w:hyperlink w:anchor="ref-elemosho2026">
         <w:r>
@@ -2393,7 +2393,7 @@
         <w:t xml:space="preserve"> </w:t>
       </w:r>
       <w:r>
-        <w:t xml:space="preserve">The multi-source classifier integrates certification, industry-payment, prescribing, enrollment, and claims signals rather than a single source, reducing the risk of misclassifying a low-volume subspecialist who stops billing Medicare but keeps operating. Back-testing reproduced observed active head count within about 1% (Appendix S3) but does not validate individual classifications; the classifier agreed with state licensure on active status (negative predictive value 0.98) yet flagged more departures than licensure recorded (about 11% versus 3%; Cohen kappa 0.06), as expected because physicians retain licenses after leaving practice. Because cessation of Open Payments reporting (the sole firing source for about 30% of detected departures) is not a validated indicator of leaving practice, the primary definition requires a corroborating non-Open-Payments anchor (Medicare Part B or Part D cessation, NPPES deactivation, or ABMS lapse); under the Open Payments-inclusive definition the ratios were lower (about 5.6 for Gynecologic Oncology and 4.3 for URPS) and under the primary definition higher, but both cohorts remained above replacement under every source-inclusion rule (Appendix S15). Because the primary outcome is departure, not active status, a high negative predictive value does not establish positive predictive value or sensitivity, and automated corroboration cannot fill the gap: within the Open-Payments-inclusive layer a non-Open-Payments signal supported 36% (Gynecologic Oncology) and 46% (URPS) of detected departures (Appendix S7b), but the anchored endpoint retains only events carrying such an anchor, so 100% are corroborated by construction, a tautology rather than validation. Genuine validation requires the prespecified two-reviewer chart adjudication, complete but pending (Appendix S7), so we report the endpoint as provisional. Death was under-ascertained by both systems; missed deaths leave deceased physicians in the active stock and bias the departure rate downward. To bound this we added age- and sex-specific expected deaths to the departure numerator (SSA Period Life Table, 2020; Appendix S25), a conservative upper bound because general-population mortality overstates physician mortality. Even so the ratios fell only to 4.3 for Gynecologic Oncology and 3.3 for URPS (5.3 and 4.2 if half were missed), both above replacement.</w:t>
+        <w:t xml:space="preserve">The multi-source classifier integrates certification, industry-payment, prescribing, enrollment, and claims signals rather than a single source such as Medicare billing cessation, intended to reduce reliance on any single source and the associated risk of misclassifying a low-volume subspecialist who stops billing Medicare but keeps operating. Back-testing reproduced observed active head count within about 1% (Appendix S3) but does not validate individual classifications; the classifier agreed with state licensure on active status (negative predictive value 0.98) yet flagged more departures than licensure recorded (about 11% versus 3%; Cohen kappa 0.06), as expected because physicians retain licenses after leaving practice. Because cessation of Open Payments reporting (the sole firing source for about 30% of detected departures) is not a validated indicator of leaving practice, the primary definition requires a corroborating non-Open-Payments anchor (Medicare Part B or Part D cessation, NPPES deactivation, or ABMS lapse); under the Open Payments-inclusive definition the ratios were lower (about 5.6 for Gynecologic Oncology and 4.3 for URPS) and under the primary definition higher, but both cohorts remained above replacement under every source-inclusion rule (Appendix S15). Because the primary outcome is departure, not active status, a high negative predictive value does not establish positive predictive value or sensitivity, and automated corroboration cannot fill the gap: within the Open-Payments-inclusive layer a non-Open-Payments signal supported 36% (Gynecologic Oncology) and 46% (URPS) of detected departures (Appendix S7b), but the anchored endpoint retains only events carrying such an anchor, so 100% are corroborated by construction, a tautology rather than validation. Genuine individual-level validation requires the prespecified two-reviewer chart adjudication, complete but pending (Appendix S7); until it is complete we do not claim the departure classifier is individually validated and report the endpoint as provisional. Death was under-ascertained by both systems; missed deaths leave deceased physicians in the active stock and drop true departure events from the numerator, biasing the departure rate downward and the completion-to-departure ratio upward. To bound this we applied an age- and sex-specific expected-mortality sensitivity, adding expected deaths to the departure numerator (SSA Period Life Table, 2020; Appendix S25), a conservative upper bound because general-population mortality overstates physician mortality. Even so the ratios fell only to 4.3 for Gynecologic Oncology and 3.3 for URPS (5.3 and 4.2 if half were missed), both above replacement.</w:t>
       </w:r>
     </w:p>
     <w:bookmarkEnd w:id="42"/>

</xml_diff>

<commit_message>
docs(manuscript): add title page + precis; cite accompanying Shiny app
- Add a formal Obstetrics & Gynecology title page (title, running head, author,
  affiliation, corresponding author, precis, word counts, financial disclosure,
  funding, keywords) that the YAML fields never rendered.
- Cite the accompanying interactive web application (new bib entry
  muffly_urps_explorer, reference 18); deployed URL flagged as an author query in
  the bib note (AMA drops note, so URL must be added before submission).
- YAML word_count/abstract limits restored to 3,000/300 (title page carries the
  actual 2,704/252). Confirmed "microsimulation" appears nowhere in the manuscript.

Co-Authored-By: Claude Opus 4.8 <noreply@anthropic.com>
Claude-Session: https://claude.ai/code/session_01Cp6JF9dTKnqU3b8oXtz5RD
</commit_message>
<xml_diff>
--- a/manuscript/manuscript_WORKFORCE_CLIFF.docx
+++ b/manuscript/manuscript_WORKFORCE_CLIFF.docx
@@ -18,13 +18,13 @@
         <w:t xml:space="preserve">August 02, 2026</w:t>
       </w:r>
     </w:p>
-    <w:bookmarkStart w:id="9" w:name="abstract"/>
-    <w:p>
-      <w:pPr>
-        <w:pStyle w:val="Heading2"/>
-      </w:pPr>
-      <w:r>
-        <w:t xml:space="preserve">Abstract</w:t>
+    <w:bookmarkStart w:id="11" w:name="title-page"/>
+    <w:p>
+      <w:pPr>
+        <w:pStyle w:val="Heading1"/>
+      </w:pPr>
+      <w:r>
+        <w:t xml:space="preserve">Title Page</w:t>
       </w:r>
     </w:p>
     <w:p>
@@ -36,13 +36,13 @@
           <w:b/>
           <w:bCs/>
         </w:rPr>
-        <w:t xml:space="preserve">OBJECTIVE:</w:t>
-      </w:r>
-      <w:r>
-        <w:t xml:space="preserve"> </w:t>
-      </w:r>
-      <w:r>
-        <w:t xml:space="preserve">To project United States urogynecology and reconstructive pelvic surgery workforce supply through 2050 and compare supply with population-based measures of demographic need.</w:t>
+        <w:t xml:space="preserve">Title:</w:t>
+      </w:r>
+      <w:r>
+        <w:t xml:space="preserve"> </w:t>
+      </w:r>
+      <w:r>
+        <w:t xml:space="preserve">United States Urogynecology Workforce Supply Relative to Demographic Need Through 2050: A Stock-and-Flow Projection</w:t>
       </w:r>
     </w:p>
     <w:p>
@@ -54,13 +54,13 @@
           <w:b/>
           <w:bCs/>
         </w:rPr>
-        <w:t xml:space="preserve">METHODS:</w:t>
-      </w:r>
-      <w:r>
-        <w:t xml:space="preserve"> </w:t>
-      </w:r>
-      <w:r>
-        <w:t xml:space="preserve">We linked American Board of Obstetrics and Gynecology and American Board of Urology certification records to national administrative data. Sustained departure from clinical practice was classified using six data sources. A pooled age-band departure hazard, estimated during the fully observable 2016–2021 period with gynecologic oncology as a comparator, informed a dynamic stock-and-flow model. Annual entrants were based on recent Accreditation Council for Graduate Medical Education fellowship completions. The primary projection covered 2025–2029; an exploratory scenario extension through 2050 compared projected supply with the number of United States women aged 65 years or older and the estimated number living with a pelvic floor disorder. Uncertainty was evaluated with Monte Carlo simulation and sensitivity analyses.</w:t>
+        <w:t xml:space="preserve">Running head:</w:t>
+      </w:r>
+      <w:r>
+        <w:t xml:space="preserve"> </w:t>
+      </w:r>
+      <w:r>
+        <w:t xml:space="preserve">Urogynecology Workforce Through 2050</w:t>
       </w:r>
     </w:p>
     <w:p>
@@ -72,13 +72,13 @@
           <w:b/>
           <w:bCs/>
         </w:rPr>
-        <w:t xml:space="preserve">RESULTS:</w:t>
-      </w:r>
-      <w:r>
-        <w:t xml:space="preserve"> </w:t>
-      </w:r>
-      <w:r>
-        <w:t xml:space="preserve">The estimated 2025 workforce included 1,306 urogynecologists. 35 classified departures during 2016–2021 informed a pooled hazard that yielded a model-implied weighted annual departure rate of 0.9%. Fellowship programs produced 64 graduates annually, compared with 11.9 projected annual departures, for a completion-to-departure ratio of 5.4 (95% uncertainty interval 3.9 to 6.5). The transition-adjusted workforce increased to 1,466 by 2029. In the exploratory 2050 scenario, workforce supply increased 84%, compared with increases of 29% in women aged 65 years or older and 19% in women living with a pelvic floor disorder. Urogynecologists per 100,000 older women increased from 3.8 to 5.4, and women with a pelvic floor disorder per urogynecologist decreased from approximately 25,400 to 16,500.</w:t>
+        <w:t xml:space="preserve">Author:</w:t>
+      </w:r>
+      <w:r>
+        <w:t xml:space="preserve"> </w:t>
+      </w:r>
+      <w:r>
+        <w:t xml:space="preserve">Tyler Muffly, MD</w:t>
       </w:r>
     </w:p>
     <w:p>
@@ -90,230 +90,434 @@
           <w:b/>
           <w:bCs/>
         </w:rPr>
-        <w:t xml:space="preserve">CONCLUSION:</w:t>
-      </w:r>
-      <w:r>
-        <w:t xml:space="preserve"> </w:t>
-      </w:r>
-      <w:r>
-        <w:t xml:space="preserve">Nationally, recent fellowship completion was sufficient to offset projected near-term departures, and scenario-based supply growth exceeded demographic growth through 2050. These findings do not measure utilization, geographic access, or operative capacity and depend on provisional departure classification and long-horizon assumptions.</w:t>
-      </w:r>
-    </w:p>
-    <w:bookmarkEnd w:id="9"/>
-    <w:bookmarkStart w:id="10" w:name="introduction"/>
-    <w:p>
-      <w:pPr>
-        <w:pStyle w:val="Heading1"/>
-      </w:pPr>
-      <w:r>
-        <w:t xml:space="preserve">Introduction</w:t>
-      </w:r>
-    </w:p>
-    <w:p>
-      <w:pPr>
-        <w:pStyle w:val="FirstParagraph"/>
-      </w:pPr>
-      <w:r>
-        <w:t xml:space="preserve">Urogynecology and reconstructive pelvic surgery provides advanced care for pelvic organ prolapse, urinary incontinence, and other pelvic floor disorders, which affect nearly one in four United States women and become more common with age.</w:t>
-      </w:r>
-      <w:hyperlink w:anchor="ref-nygaard2008">
-        <w:r>
-          <w:rPr>
-            <w:rStyle w:val="Hyperlink"/>
-            <w:vertAlign w:val="superscript"/>
-          </w:rPr>
-          <w:t xml:space="preserve">1</w:t>
-        </w:r>
-      </w:hyperlink>
-      <w:r>
-        <w:t xml:space="preserve"> </w:t>
-      </w:r>
-      <w:r>
-        <w:t xml:space="preserve">The population of women aged 65 years or older is projected to increase substantially through 2050, creating concern that an aging subspecialty workforce may not keep pace with future need. Workforce planning, however, requires more than a count of certified physicians. It also requires measurement of the active workforce, the number of physicians entering and leaving practice, and the clinical capacity and geographic distribution of those physicians.</w:t>
+        <w:t xml:space="preserve">Affiliation:</w:t>
+      </w:r>
+      <w:r>
+        <w:t xml:space="preserve"> </w:t>
+      </w:r>
+      <w:r>
+        <w:t xml:space="preserve">Department of Obstetrics and Gynecology, Denver Health Medical Center, and University of Colorado School of Medicine, Denver, Colorado.</w:t>
       </w:r>
     </w:p>
     <w:p>
       <w:pPr>
         <w:pStyle w:val="BodyText"/>
       </w:pPr>
-      <w:r>
-        <w:t xml:space="preserve">The only prior national urogynecology projection compared projected subspecialist headcount with the number of women living with pelvic floor disorders, but it assumed retirement rather than estimating departure from practice and did not incorporate the urology certification pathway or productivity-adjusted capacity.</w:t>
-      </w:r>
-      <w:hyperlink w:anchor="ref-brueseke2016">
-        <w:r>
-          <w:rPr>
-            <w:rStyle w:val="Hyperlink"/>
-            <w:vertAlign w:val="superscript"/>
-          </w:rPr>
-          <w:t xml:space="preserve">2</w:t>
-        </w:r>
-      </w:hyperlink>
-      <w:r>
-        <w:t xml:space="preserve"> </w:t>
-      </w:r>
-      <w:r>
-        <w:t xml:space="preserve">Other surgical workforce models have shown the value of dynamic stock-and-flow methods, age-specific departure rates, and explicit uncertainty analyses.</w:t>
-      </w:r>
-      <w:hyperlink w:anchor="ref-etzioni2003">
-        <w:r>
-          <w:rPr>
-            <w:rStyle w:val="Hyperlink"/>
-            <w:vertAlign w:val="superscript"/>
-          </w:rPr>
-          <w:t xml:space="preserve">3</w:t>
-        </w:r>
-      </w:hyperlink>
-      <w:r>
-        <w:rPr>
-          <w:vertAlign w:val="superscript"/>
-        </w:rPr>
-        <w:t xml:space="preserve">–</w:t>
-      </w:r>
-      <w:hyperlink w:anchor="ref-leejt2024">
-        <w:r>
-          <w:rPr>
-            <w:rStyle w:val="Hyperlink"/>
-            <w:vertAlign w:val="superscript"/>
-          </w:rPr>
-          <w:t xml:space="preserve">6</w:t>
-        </w:r>
-      </w:hyperlink>
-      <w:r>
-        <w:t xml:space="preserve"> </w:t>
-      </w:r>
-      <w:r>
-        <w:t xml:space="preserve">Federal models cannot isolate gynecologic subspecialties from the broader obstetrics and gynecology workforce, and administrative studies often infer departure from a single signal, such as cessation of Medicare billing.</w:t>
-      </w:r>
-      <w:hyperlink w:anchor="ref-rayburn2025complexities">
-        <w:r>
-          <w:rPr>
-            <w:rStyle w:val="Hyperlink"/>
-            <w:vertAlign w:val="superscript"/>
-          </w:rPr>
-          <w:t xml:space="preserve">7</w:t>
-        </w:r>
-      </w:hyperlink>
-      <w:r>
-        <w:t xml:space="preserve"> </w:t>
-      </w:r>
-      <w:r>
-        <w:t xml:space="preserve">Thus, it remains unclear whether current fellowship output is sufficient to replace urogynecologists leaving clinical practice and whether projected supply will keep pace with population-based measures of pelvic floor disorder need.</w:t>
-      </w:r>
-    </w:p>
-    <w:p>
-      <w:pPr>
-        <w:pStyle w:val="BodyText"/>
-      </w:pPr>
-      <w:r>
-        <w:t xml:space="preserve">We assembled a national active workforce that included both the obstetrics-gynecology and urology certification pathways and classified sustained clinical-practice departure using six administrative data sources. Gynecologic oncology was included as a supply-side comparator because of its similar fellowship structure and age distribution; we did not model gynecologic oncology demand. We then used a dynamic age-structured model to project near-term workforce supply from 2025 through 2029 and extended the model through 2050 as an exploratory scenario aligned with demographic projections. Supply was evaluated as headcount and productivity-adjusted capacity relative to older women and women living with pelvic floor disorders. We hypothesized that recent fellowship output would offset near-term departures but that demographic growth would reduce per-capita coverage.</w:t>
-      </w:r>
-    </w:p>
-    <w:bookmarkEnd w:id="10"/>
-    <w:bookmarkStart w:id="18" w:name="materials-and-methods"/>
-    <w:p>
-      <w:pPr>
-        <w:pStyle w:val="Heading1"/>
-      </w:pPr>
-      <w:r>
-        <w:t xml:space="preserve">Materials and Methods</w:t>
-      </w:r>
-    </w:p>
-    <w:bookmarkStart w:id="11" w:name="study-design-and-data-period"/>
-    <w:p>
-      <w:pPr>
-        <w:pStyle w:val="Heading2"/>
-      </w:pPr>
-      <w:r>
-        <w:t xml:space="preserve">Study Design and Data Period</w:t>
-      </w:r>
-    </w:p>
-    <w:p>
-      <w:pPr>
-        <w:pStyle w:val="FirstParagraph"/>
-      </w:pPr>
-      <w:r>
-        <w:t xml:space="preserve">This was a dynamic stock-and-flow projection built from retrospective administrative data, following supply-forecast methods used for other subspecialty workforces.</w:t>
-      </w:r>
-      <w:hyperlink w:anchor="ref-shah2026">
-        <w:r>
-          <w:rPr>
-            <w:rStyle w:val="Hyperlink"/>
-            <w:vertAlign w:val="superscript"/>
-          </w:rPr>
-          <w:t xml:space="preserve">8</w:t>
-        </w:r>
-      </w:hyperlink>
-      <w:r>
-        <w:t xml:space="preserve"> </w:t>
-      </w:r>
-      <w:r>
-        <w:t xml:space="preserve">We classified clinical-practice departures during the fully observable 2016–2021 period and applied them in a dynamic age-structured projection of an estimated 2025 active baseline. Because the source data end in 2023–2024 (Medicare Part B and Part D through 2023; Open Payments through 2024), the 2025 workforce is an estimate carried forward from the latest signals, not a directly observed census (baseline-lag sensitivity, Appendix S1). Analyses used public-record professional data: board certification, National Provider Identifier records from the National Plan and Provider Enumeration System,</w:t>
-      </w:r>
-      <w:hyperlink w:anchor="ref-nber2024">
-        <w:r>
-          <w:rPr>
-            <w:rStyle w:val="Hyperlink"/>
-            <w:vertAlign w:val="superscript"/>
-          </w:rPr>
-          <w:t xml:space="preserve">9</w:t>
-        </w:r>
-      </w:hyperlink>
-      <w:r>
-        <w:t xml:space="preserve"> </w:t>
-      </w:r>
-      <w:r>
-        <w:t xml:space="preserve">and Medicare administrative files. The Denver Health institutional review board determined that the study was not human-subjects research, and we followed STROBE reporting guidelines.</w:t>
-      </w:r>
-      <w:hyperlink w:anchor="ref-vonelm2007">
-        <w:r>
-          <w:rPr>
-            <w:rStyle w:val="Hyperlink"/>
-            <w:vertAlign w:val="superscript"/>
-          </w:rPr>
-          <w:t xml:space="preserve">10</w:t>
-        </w:r>
-      </w:hyperlink>
-    </w:p>
-    <w:bookmarkEnd w:id="11"/>
-    <w:bookmarkStart w:id="12" w:name="X0ac0a7d7270e1bf2557c7195b8aa884ce4c6091"/>
-    <w:p>
-      <w:pPr>
-        <w:pStyle w:val="Heading2"/>
-      </w:pPr>
-      <w:r>
-        <w:t xml:space="preserve">Physician Cohort and Both-Pathway Urogynecology Roster</w:t>
-      </w:r>
-    </w:p>
-    <w:p>
-      <w:pPr>
-        <w:pStyle w:val="FirstParagraph"/>
-      </w:pPr>
-      <w:r>
-        <w:t xml:space="preserve">Subspecialty was defined by board certification rather than administrative taxonomy codes. Urogynecology and reconstructive pelvic surgery is certified through both the American Board of Obstetrics and Gynecology (ABOG) and the American Board of Urology (ABU); because the Accreditation Council for Graduate Medical Education (ACGME) graduate count spans both, we built a both-pathway roster of ABOG-certified urogynecologists plus ABU-certified urogynecologists not already included. ABU physicians were matched to National Provider Identifiers and de-duplicated against the ABOG cohort, with taxonomy-based adjudication of same-name matches (Appendix S1). The estimated 2025 active urogynecology workforce was 1,306, comprising 1,027 ABOG-certified urogynecologists and 279 ABU physicians whose subspecialty certification was effective by 2023.</w:t>
-      </w:r>
-      <w:hyperlink w:anchor="ref-plaska2025">
-        <w:r>
-          <w:rPr>
-            <w:rStyle w:val="Hyperlink"/>
-            <w:vertAlign w:val="superscript"/>
-          </w:rPr>
-          <w:t xml:space="preserve">11</w:t>
-        </w:r>
-      </w:hyperlink>
-      <w:r>
-        <w:t xml:space="preserve"> </w:t>
-      </w:r>
-      <w:r>
-        <w:t xml:space="preserve">Each physician’s age was reconstructed from the subspecialty certification year where recorded and otherwise from a fellowship-timing proxy. As external evidence of active practice, most urology-pathway physicians had Medicare fee-for-service procedure activity in the empirically defined pelvic floor code set in 2024.</w:t>
-      </w:r>
-      <w:r>
-        <w:t xml:space="preserve"> </w:t>
-      </w:r>
       <w:r>
         <w:rPr>
           <w:b/>
           <w:bCs/>
         </w:rPr>
+        <w:t xml:space="preserve">Corresponding author:</w:t>
+      </w:r>
+      <w:r>
+        <w:t xml:space="preserve"> </w:t>
+      </w:r>
+      <w:r>
+        <w:t xml:space="preserve">Tyler Muffly, MD, Department of Obstetrics and Gynecology, Denver Health Medical Center, 777 Bannock Street, Denver, CO 80204; email</w:t>
+      </w:r>
+      <w:r>
+        <w:t xml:space="preserve"> </w:t>
+      </w:r>
+      <w:hyperlink r:id="rId9">
+        <w:r>
+          <w:rPr>
+            <w:rStyle w:val="Hyperlink"/>
+          </w:rPr>
+          <w:t xml:space="preserve">tyler.muffly@dhha.org</w:t>
+        </w:r>
+      </w:hyperlink>
+      <w:r>
+        <w:t xml:space="preserve">.</w:t>
+      </w:r>
+    </w:p>
+    <w:p>
+      <w:pPr>
+        <w:pStyle w:val="BodyText"/>
+      </w:pPr>
+      <w:r>
+        <w:rPr>
+          <w:b/>
+          <w:bCs/>
+        </w:rPr>
+        <w:t xml:space="preserve">Précis:</w:t>
+      </w:r>
+      <w:r>
+        <w:t xml:space="preserve"> </w:t>
+      </w:r>
+      <w:r>
+        <w:t xml:space="preserve">Recent fellowship completion exceeded projected near-term departures, but national workforce growth did not establish geographic access or operative capacity.</w:t>
+      </w:r>
+    </w:p>
+    <w:p>
+      <w:pPr>
+        <w:pStyle w:val="BodyText"/>
+      </w:pPr>
+      <w:r>
+        <w:rPr>
+          <w:b/>
+          <w:bCs/>
+        </w:rPr>
+        <w:t xml:space="preserve">Word count:</w:t>
+      </w:r>
+      <w:r>
+        <w:t xml:space="preserve"> </w:t>
+      </w:r>
+      <w:r>
+        <w:t xml:space="preserve">abstract 252 words; main text approximately 2,700 words.</w:t>
+      </w:r>
+    </w:p>
+    <w:p>
+      <w:pPr>
+        <w:pStyle w:val="BodyText"/>
+      </w:pPr>
+      <w:r>
+        <w:rPr>
+          <w:b/>
+          <w:bCs/>
+        </w:rPr>
+        <w:t xml:space="preserve">Financial disclosure:</w:t>
+      </w:r>
+      <w:r>
+        <w:t xml:space="preserve"> </w:t>
+      </w:r>
+      <w:r>
+        <w:t xml:space="preserve">The authors report no conflict of interest.</w:t>
+      </w:r>
+    </w:p>
+    <w:p>
+      <w:pPr>
+        <w:pStyle w:val="BodyText"/>
+      </w:pPr>
+      <w:r>
+        <w:rPr>
+          <w:b/>
+          <w:bCs/>
+        </w:rPr>
+        <w:t xml:space="preserve">Funding:</w:t>
+      </w:r>
+      <w:r>
+        <w:t xml:space="preserve"> </w:t>
+      </w:r>
+      <w:r>
+        <w:t xml:space="preserve">This research received no specific grant from any funding agency in the public, commercial, or not-for-profit sectors.</w:t>
+      </w:r>
+    </w:p>
+    <w:p>
+      <w:pPr>
+        <w:pStyle w:val="BodyText"/>
+      </w:pPr>
+      <w:r>
+        <w:rPr>
+          <w:b/>
+          <w:bCs/>
+        </w:rPr>
+        <w:t xml:space="preserve">Keywords:</w:t>
+      </w:r>
+      <w:r>
+        <w:t xml:space="preserve"> </w:t>
+      </w:r>
+      <w:r>
+        <w:t xml:space="preserve">urogynecology; pelvic floor disorders; physician workforce projection; workforce supply and demand; clinical-practice departure; fellowship training.</w:t>
+      </w:r>
+    </w:p>
+    <w:bookmarkStart w:id="10" w:name="abstract"/>
+    <w:p>
+      <w:pPr>
+        <w:pStyle w:val="Heading2"/>
+      </w:pPr>
+      <w:r>
+        <w:t xml:space="preserve">Abstract</w:t>
+      </w:r>
+    </w:p>
+    <w:p>
+      <w:pPr>
+        <w:pStyle w:val="FirstParagraph"/>
+      </w:pPr>
+      <w:r>
+        <w:rPr>
+          <w:b/>
+          <w:bCs/>
+        </w:rPr>
+        <w:t xml:space="preserve">OBJECTIVE:</w:t>
+      </w:r>
+      <w:r>
+        <w:t xml:space="preserve"> </w:t>
+      </w:r>
+      <w:r>
+        <w:t xml:space="preserve">To project United States urogynecology and reconstructive pelvic surgery workforce supply through 2050 and compare supply with population-based measures of demographic need.</w:t>
+      </w:r>
+    </w:p>
+    <w:p>
+      <w:pPr>
+        <w:pStyle w:val="BodyText"/>
+      </w:pPr>
+      <w:r>
+        <w:rPr>
+          <w:b/>
+          <w:bCs/>
+        </w:rPr>
+        <w:t xml:space="preserve">METHODS:</w:t>
+      </w:r>
+      <w:r>
+        <w:t xml:space="preserve"> </w:t>
+      </w:r>
+      <w:r>
+        <w:t xml:space="preserve">We linked American Board of Obstetrics and Gynecology and American Board of Urology certification records to national administrative data. Sustained departure from clinical practice was classified using six data sources. A pooled age-band departure hazard, estimated during the fully observable 2016–2021 period with gynecologic oncology as a comparator, informed a dynamic stock-and-flow model. Annual entrants were based on recent Accreditation Council for Graduate Medical Education fellowship completions. The primary projection covered 2025–2029; an exploratory scenario extension through 2050 compared projected supply with the number of United States women aged 65 years or older and the estimated number living with a pelvic floor disorder. Uncertainty was evaluated with Monte Carlo simulation and sensitivity analyses.</w:t>
+      </w:r>
+    </w:p>
+    <w:p>
+      <w:pPr>
+        <w:pStyle w:val="BodyText"/>
+      </w:pPr>
+      <w:r>
+        <w:rPr>
+          <w:b/>
+          <w:bCs/>
+        </w:rPr>
+        <w:t xml:space="preserve">RESULTS:</w:t>
+      </w:r>
+      <w:r>
+        <w:t xml:space="preserve"> </w:t>
+      </w:r>
+      <w:r>
+        <w:t xml:space="preserve">The estimated 2025 workforce included 1,306 urogynecologists. 35 classified departures during 2016–2021 informed a pooled hazard that yielded a model-implied weighted annual departure rate of 0.9%. Fellowship programs produced 64 graduates annually, compared with 11.9 projected annual departures, for a completion-to-departure ratio of 5.4 (95% uncertainty interval 3.9 to 6.5). The transition-adjusted workforce increased to 1,466 by 2029. In the exploratory 2050 scenario, workforce supply increased 84%, compared with increases of 29% in women aged 65 years or older and 19% in women living with a pelvic floor disorder. Urogynecologists per 100,000 older women increased from 3.8 to 5.4, and women with a pelvic floor disorder per urogynecologist decreased from approximately 25,400 to 16,500.</w:t>
+      </w:r>
+    </w:p>
+    <w:p>
+      <w:pPr>
+        <w:pStyle w:val="BodyText"/>
+      </w:pPr>
+      <w:r>
+        <w:rPr>
+          <w:b/>
+          <w:bCs/>
+        </w:rPr>
+        <w:t xml:space="preserve">CONCLUSION:</w:t>
+      </w:r>
+      <w:r>
+        <w:t xml:space="preserve"> </w:t>
+      </w:r>
+      <w:r>
+        <w:t xml:space="preserve">Nationally, recent fellowship completion was sufficient to offset projected near-term departures, and scenario-based supply growth exceeded demographic growth through 2050. These findings do not measure utilization, geographic access, or operative capacity and depend on provisional departure classification and long-horizon assumptions.</w:t>
+      </w:r>
+    </w:p>
+    <w:bookmarkEnd w:id="10"/>
+    <w:bookmarkEnd w:id="11"/>
+    <w:bookmarkStart w:id="12" w:name="introduction"/>
+    <w:p>
+      <w:pPr>
+        <w:pStyle w:val="Heading1"/>
+      </w:pPr>
+      <w:r>
+        <w:t xml:space="preserve">Introduction</w:t>
+      </w:r>
+    </w:p>
+    <w:p>
+      <w:pPr>
+        <w:pStyle w:val="FirstParagraph"/>
+      </w:pPr>
+      <w:r>
+        <w:t xml:space="preserve">Urogynecology and reconstructive pelvic surgery provides advanced care for pelvic organ prolapse, urinary incontinence, and other pelvic floor disorders, which affect nearly one in four United States women and become more common with age.</w:t>
+      </w:r>
+      <w:hyperlink w:anchor="ref-nygaard2008">
+        <w:r>
+          <w:rPr>
+            <w:rStyle w:val="Hyperlink"/>
+            <w:vertAlign w:val="superscript"/>
+          </w:rPr>
+          <w:t xml:space="preserve">1</w:t>
+        </w:r>
+      </w:hyperlink>
+      <w:r>
+        <w:t xml:space="preserve"> </w:t>
+      </w:r>
+      <w:r>
+        <w:t xml:space="preserve">The population of women aged 65 years or older is projected to increase substantially through 2050, creating concern that an aging subspecialty workforce may not keep pace with future need. Workforce planning, however, requires more than a count of certified physicians. It also requires measurement of the active workforce, the number of physicians entering and leaving practice, and the clinical capacity and geographic distribution of those physicians.</w:t>
+      </w:r>
+    </w:p>
+    <w:p>
+      <w:pPr>
+        <w:pStyle w:val="BodyText"/>
+      </w:pPr>
+      <w:r>
+        <w:t xml:space="preserve">The only prior national urogynecology projection compared projected subspecialist headcount with the number of women living with pelvic floor disorders, but it assumed retirement rather than estimating departure from practice and did not incorporate the urology certification pathway or productivity-adjusted capacity.</w:t>
+      </w:r>
+      <w:hyperlink w:anchor="ref-brueseke2016">
+        <w:r>
+          <w:rPr>
+            <w:rStyle w:val="Hyperlink"/>
+            <w:vertAlign w:val="superscript"/>
+          </w:rPr>
+          <w:t xml:space="preserve">2</w:t>
+        </w:r>
+      </w:hyperlink>
+      <w:r>
+        <w:t xml:space="preserve"> </w:t>
+      </w:r>
+      <w:r>
+        <w:t xml:space="preserve">Other surgical workforce models have shown the value of dynamic stock-and-flow methods, age-specific departure rates, and explicit uncertainty analyses.</w:t>
+      </w:r>
+      <w:hyperlink w:anchor="ref-etzioni2003">
+        <w:r>
+          <w:rPr>
+            <w:rStyle w:val="Hyperlink"/>
+            <w:vertAlign w:val="superscript"/>
+          </w:rPr>
+          <w:t xml:space="preserve">3</w:t>
+        </w:r>
+      </w:hyperlink>
+      <w:r>
+        <w:rPr>
+          <w:vertAlign w:val="superscript"/>
+        </w:rPr>
+        <w:t xml:space="preserve">–</w:t>
+      </w:r>
+      <w:hyperlink w:anchor="ref-leejt2024">
+        <w:r>
+          <w:rPr>
+            <w:rStyle w:val="Hyperlink"/>
+            <w:vertAlign w:val="superscript"/>
+          </w:rPr>
+          <w:t xml:space="preserve">6</w:t>
+        </w:r>
+      </w:hyperlink>
+      <w:r>
+        <w:t xml:space="preserve"> </w:t>
+      </w:r>
+      <w:r>
+        <w:t xml:space="preserve">Federal models cannot isolate gynecologic subspecialties from the broader obstetrics and gynecology workforce, and administrative studies often infer departure from a single signal, such as cessation of Medicare billing.</w:t>
+      </w:r>
+      <w:hyperlink w:anchor="ref-rayburn2025complexities">
+        <w:r>
+          <w:rPr>
+            <w:rStyle w:val="Hyperlink"/>
+            <w:vertAlign w:val="superscript"/>
+          </w:rPr>
+          <w:t xml:space="preserve">7</w:t>
+        </w:r>
+      </w:hyperlink>
+      <w:r>
+        <w:t xml:space="preserve"> </w:t>
+      </w:r>
+      <w:r>
+        <w:t xml:space="preserve">Thus, it remains unclear whether current fellowship output is sufficient to replace urogynecologists leaving clinical practice and whether projected supply will keep pace with population-based measures of pelvic floor disorder need.</w:t>
+      </w:r>
+    </w:p>
+    <w:p>
+      <w:pPr>
+        <w:pStyle w:val="BodyText"/>
+      </w:pPr>
+      <w:r>
+        <w:t xml:space="preserve">We assembled a national active workforce that included both the obstetrics-gynecology and urology certification pathways and classified sustained clinical-practice departure using six administrative data sources. Gynecologic oncology was included as a supply-side comparator because of its similar fellowship structure and age distribution; we did not model gynecologic oncology demand. We then used a dynamic age-structured model to project near-term workforce supply from 2025 through 2029 and extended the model through 2050 as an exploratory scenario aligned with demographic projections. Supply was evaluated as headcount and productivity-adjusted capacity relative to older women and women living with pelvic floor disorders. We hypothesized that recent fellowship output would offset near-term departures but that demographic growth would reduce per-capita coverage.</w:t>
+      </w:r>
+    </w:p>
+    <w:bookmarkEnd w:id="12"/>
+    <w:bookmarkStart w:id="20" w:name="materials-and-methods"/>
+    <w:p>
+      <w:pPr>
+        <w:pStyle w:val="Heading1"/>
+      </w:pPr>
+      <w:r>
+        <w:t xml:space="preserve">Materials and Methods</w:t>
+      </w:r>
+    </w:p>
+    <w:bookmarkStart w:id="13" w:name="study-design-and-data-period"/>
+    <w:p>
+      <w:pPr>
+        <w:pStyle w:val="Heading2"/>
+      </w:pPr>
+      <w:r>
+        <w:t xml:space="preserve">Study Design and Data Period</w:t>
+      </w:r>
+    </w:p>
+    <w:p>
+      <w:pPr>
+        <w:pStyle w:val="FirstParagraph"/>
+      </w:pPr>
+      <w:r>
+        <w:t xml:space="preserve">This was a dynamic stock-and-flow projection built from retrospective administrative data, following supply-forecast methods used for other subspecialty workforces.</w:t>
+      </w:r>
+      <w:hyperlink w:anchor="ref-shah2026">
+        <w:r>
+          <w:rPr>
+            <w:rStyle w:val="Hyperlink"/>
+            <w:vertAlign w:val="superscript"/>
+          </w:rPr>
+          <w:t xml:space="preserve">8</w:t>
+        </w:r>
+      </w:hyperlink>
+      <w:r>
+        <w:t xml:space="preserve"> </w:t>
+      </w:r>
+      <w:r>
+        <w:t xml:space="preserve">We classified clinical-practice departures during the fully observable 2016–2021 period and applied them in a dynamic age-structured projection of an estimated 2025 active baseline. Because the source data end in 2023–2024 (Medicare Part B and Part D through 2023; Open Payments through 2024), the 2025 workforce is an estimate carried forward from the latest signals, not a directly observed census (baseline-lag sensitivity, Appendix S1). Analyses used public-record professional data: board certification, National Provider Identifier records from the National Plan and Provider Enumeration System,</w:t>
+      </w:r>
+      <w:hyperlink w:anchor="ref-nber2024">
+        <w:r>
+          <w:rPr>
+            <w:rStyle w:val="Hyperlink"/>
+            <w:vertAlign w:val="superscript"/>
+          </w:rPr>
+          <w:t xml:space="preserve">9</w:t>
+        </w:r>
+      </w:hyperlink>
+      <w:r>
+        <w:t xml:space="preserve"> </w:t>
+      </w:r>
+      <w:r>
+        <w:t xml:space="preserve">and Medicare administrative files. The Denver Health institutional review board determined that the study was not human-subjects research, and we followed STROBE reporting guidelines.</w:t>
+      </w:r>
+      <w:hyperlink w:anchor="ref-vonelm2007">
+        <w:r>
+          <w:rPr>
+            <w:rStyle w:val="Hyperlink"/>
+            <w:vertAlign w:val="superscript"/>
+          </w:rPr>
+          <w:t xml:space="preserve">10</w:t>
+        </w:r>
+      </w:hyperlink>
+    </w:p>
+    <w:bookmarkEnd w:id="13"/>
+    <w:bookmarkStart w:id="14" w:name="X0ac0a7d7270e1bf2557c7195b8aa884ce4c6091"/>
+    <w:p>
+      <w:pPr>
+        <w:pStyle w:val="Heading2"/>
+      </w:pPr>
+      <w:r>
+        <w:t xml:space="preserve">Physician Cohort and Both-Pathway Urogynecology Roster</w:t>
+      </w:r>
+    </w:p>
+    <w:p>
+      <w:pPr>
+        <w:pStyle w:val="FirstParagraph"/>
+      </w:pPr>
+      <w:r>
+        <w:t xml:space="preserve">Subspecialty was defined by board certification rather than administrative taxonomy codes. Urogynecology and reconstructive pelvic surgery is certified through both the American Board of Obstetrics and Gynecology (ABOG) and the American Board of Urology (ABU); because the Accreditation Council for Graduate Medical Education (ACGME) graduate count spans both, we built a both-pathway roster of ABOG-certified urogynecologists plus ABU-certified urogynecologists not already included. ABU physicians were matched to National Provider Identifiers and de-duplicated against the ABOG cohort, with taxonomy-based adjudication of same-name matches (Appendix S1). The estimated 2025 active urogynecology workforce was 1,306, comprising 1,027 ABOG-certified urogynecologists and 279 ABU physicians whose subspecialty certification was effective by 2023.</w:t>
+      </w:r>
+      <w:hyperlink w:anchor="ref-plaska2025">
+        <w:r>
+          <w:rPr>
+            <w:rStyle w:val="Hyperlink"/>
+            <w:vertAlign w:val="superscript"/>
+          </w:rPr>
+          <w:t xml:space="preserve">11</w:t>
+        </w:r>
+      </w:hyperlink>
+      <w:r>
+        <w:t xml:space="preserve"> </w:t>
+      </w:r>
+      <w:r>
+        <w:t xml:space="preserve">Each physician’s age was reconstructed from the subspecialty certification year where recorded and otherwise from a fellowship-timing proxy. As external evidence of active practice, most urology-pathway physicians had Medicare fee-for-service procedure activity in the empirically defined pelvic floor code set in 2024.</w:t>
+      </w:r>
+      <w:r>
+        <w:t xml:space="preserve"> </w:t>
+      </w:r>
+      <w:r>
+        <w:rPr>
+          <w:b/>
+          <w:bCs/>
+        </w:rPr>
         <w:t xml:space="preserve">[[AUTHOR QUERY: Clarify the 2024 Medicare procedure-validation source versus the 2013–2023 Medicare Part B analysis window.]]</w:t>
       </w:r>
       <w:r>
@@ -323,8 +527,8 @@
         <w:t xml:space="preserve">Gynecologic oncology was identified from ABOG records as a supply-side comparator. Minimally invasive gynecologic surgery is a voluntary focused-practice designation, not a board certification, and was excluded from the primary analysis (Appendix S13). No geographic restriction was applied; fewer than three subspecialists practiced outside the contiguous states.</w:t>
       </w:r>
     </w:p>
-    <w:bookmarkEnd w:id="12"/>
-    <w:bookmarkStart w:id="13" w:name="Xdf6c681a67ef61aa825747aa09b49047352ad82"/>
+    <w:bookmarkEnd w:id="14"/>
+    <w:bookmarkStart w:id="15" w:name="Xdf6c681a67ef61aa825747aa09b49047352ad82"/>
     <w:p>
       <w:pPr>
         <w:pStyle w:val="Heading2"/>
@@ -386,8 +590,8 @@
         <w:t xml:space="preserve">Because physician-level adjudication is not yet incorporated, the classification is provisional (Appendix S7). Hazards were estimated only over the fully observable 2016–2021 period: departures dated 2022–2023 cannot be confirmed under the three-year follow-up rule with data ending in 2023–2024 and were treated as right-censored.</w:t>
       </w:r>
     </w:p>
-    <w:bookmarkEnd w:id="13"/>
-    <w:bookmarkStart w:id="14" w:name="fellowship-entrants"/>
+    <w:bookmarkEnd w:id="15"/>
+    <w:bookmarkStart w:id="16" w:name="fellowship-entrants"/>
     <w:p>
       <w:pPr>
         <w:pStyle w:val="Heading2"/>
@@ -428,8 +632,8 @@
         </w:r>
       </w:hyperlink>
     </w:p>
-    <w:bookmarkEnd w:id="14"/>
-    <w:bookmarkStart w:id="15" w:name="Xae6b2f66a3a313683a91c5f8a4517248347a5c8"/>
+    <w:bookmarkEnd w:id="16"/>
+    <w:bookmarkStart w:id="17" w:name="Xae6b2f66a3a313683a91c5f8a4517248347a5c8"/>
     <w:p>
       <w:pPr>
         <w:pStyle w:val="Heading2"/>
@@ -461,8 +665,8 @@
         <w:t xml:space="preserve">Given only two board-certified cohorts and sparse events (36 gynecologic oncology and 35 urogynecology departures, 71 pooled, during 2016–2021), the primary hazard pooled the two cohorts into a single shared age-band hazard; hierarchical partial-pooled and fully unpooled hazards are reported as bracketing sensitivities (Appendix S6b, Appendix Table S28). Applying the pooled hazard to each cohort’s estimated 2025 age distribution yielded model-implied weighted annual departure rates of 1.0% for gynecologic oncology and 0.9% for urogynecology; these rates are generated by the age-band hazard acting on the age distribution, not read directly from the event counts. The primary projection covered 2025–2029: each year the cohort ages, age-band hazards remove departures, and graduates enter at their entry age (full specification, Appendix S1). Reproduction of the 2016–2021 cohort’s own survival is an in-sample calibration check, within about 1% of observed active headcount (Appendix S3), not out-of-sample validation. The fellowship-completion-to-departure ratio is annual fellowship completions divided by mean annual departures; it is a supply-side flow balance, not a count of confirmed active replacements. Uncertainty in the 2029 count used a 10,000-iteration Monte Carlo simulation (Beta posteriors on the band hazards; empirical resampling of the four annual graduate counts); the 2.5th–97.5th percentiles are the reported 95% uncertainty interval, which reflects parameter uncertainty and does not include baseline-classification error. A multidimensional sensitivity analysis crossed the observation window (2016–2021, 2016–2019, 2016–2023), a departure-rate multiplier up to threefold, and graduate conversion of 70%–100% (Appendix S12). The status-quo entrant scenario (recent four-year mean) is primary, bracketed by conservative (70% conversion) and optimistic (National Resident Matching Program benchmark) scenarios.</w:t>
       </w:r>
     </w:p>
-    <w:bookmarkEnd w:id="15"/>
-    <w:bookmarkStart w:id="16" w:name="Xeaa3f1f66f49c225b0744449c8d8cf32360815f"/>
+    <w:bookmarkEnd w:id="17"/>
+    <w:bookmarkStart w:id="18" w:name="Xeaa3f1f66f49c225b0744449c8d8cf32360815f"/>
     <w:p>
       <w:pPr>
         <w:pStyle w:val="Heading2"/>
@@ -506,8 +710,17 @@
         <w:t xml:space="preserve"> </w:t>
       </w:r>
       <w:r>
-        <w:t xml:space="preserve">The primary model covered 2025–2029; an exploratory scenario extension carried the same inputs through 2050 to align with the demographic projections, and its long-horizon values are provisional rather than validated forecasts. An accompanying interactive tool allows the productivity and pathway assumptions to be varied.</w:t>
-      </w:r>
+        <w:t xml:space="preserve">The primary model covered 2025–2029; an exploratory scenario extension carried the same inputs through 2050 to align with the demographic projections, and its long-horizon values are provisional rather than validated forecasts. An accompanying interactive web application allows the productivity, pathway, and scenario assumptions to be varied.</w:t>
+      </w:r>
+      <w:hyperlink w:anchor="ref-muffly_urps_explorer">
+        <w:r>
+          <w:rPr>
+            <w:rStyle w:val="Hyperlink"/>
+            <w:vertAlign w:val="superscript"/>
+          </w:rPr>
+          <w:t xml:space="preserve">18</w:t>
+        </w:r>
+      </w:hyperlink>
     </w:p>
     <w:p>
       <w:pPr>
@@ -517,8 +730,8 @@
         <w:t xml:space="preserve">An exploratory operative-workforce analysis using Medicare fee-for-service by-service claims could not distinguish true cessation of surgery from loss of Medicare visibility; operative replacement was therefore not estimated in the primary manuscript, and its methods and results are reported in the Supplemental Digital Content (Appendix S11).</w:t>
       </w:r>
     </w:p>
-    <w:bookmarkEnd w:id="16"/>
-    <w:bookmarkStart w:id="17" w:name="statistical-analysis"/>
+    <w:bookmarkEnd w:id="18"/>
+    <w:bookmarkStart w:id="19" w:name="statistical-analysis"/>
     <w:p>
       <w:pPr>
         <w:pStyle w:val="Heading2"/>
@@ -540,7 +753,7 @@
             <w:rStyle w:val="Hyperlink"/>
             <w:vertAlign w:val="superscript"/>
           </w:rPr>
-          <w:t xml:space="preserve">18</w:t>
+          <w:t xml:space="preserve">19</w:t>
         </w:r>
       </w:hyperlink>
       <w:r>
@@ -550,9 +763,9 @@
         <w:t xml:space="preserve">Workforce counts are point estimates from the dynamic model with a 95% Monte Carlo uncertainty interval, conditional on the baseline classification, the model structure, and stable graduate output. Because the projection is a structural model of its inputs rather than an estimate from a random sample, no hypothesis tests were performed and no P values are reported. We retained the distinction between the estimated 2025 baseline and the directly observed administrative data ending in 2023–2024.</w:t>
       </w:r>
     </w:p>
-    <w:bookmarkEnd w:id="17"/>
-    <w:bookmarkEnd w:id="18"/>
-    <w:bookmarkStart w:id="32" w:name="results"/>
+    <w:bookmarkEnd w:id="19"/>
+    <w:bookmarkEnd w:id="20"/>
+    <w:bookmarkStart w:id="34" w:name="results"/>
     <w:p>
       <w:pPr>
         <w:pStyle w:val="Heading1"/>
@@ -561,7 +774,7 @@
         <w:t xml:space="preserve">Results</w:t>
       </w:r>
     </w:p>
-    <w:bookmarkStart w:id="19" w:name="estimated-workforce-and-model-inputs"/>
+    <w:bookmarkStart w:id="21" w:name="estimated-workforce-and-model-inputs"/>
     <w:p>
       <w:pPr>
         <w:pStyle w:val="Heading2"/>
@@ -813,8 +1026,8 @@
         <w:t xml:space="preserve">The estimated 2025 active urogynecology workforce was 1,306, with a model-implied weighted annual departure rate of 0.9% and 11.9 projected annual departures; fellowship programs produced 64 graduates annually (Table 1). The gynecologic oncology comparator included 1,052 physicians, with a 1.0% departure rate and 75 annual graduates. The two weighted rates are similar because both apply the shared pooled hazard, differing only through each cohort’s age structure.</w:t>
       </w:r>
     </w:p>
-    <w:bookmarkEnd w:id="19"/>
-    <w:bookmarkStart w:id="23" w:name="near-term-workforce-projection-20252029"/>
+    <w:bookmarkEnd w:id="21"/>
+    <w:bookmarkStart w:id="25" w:name="near-term-workforce-projection-20252029"/>
     <w:p>
       <w:pPr>
         <w:pStyle w:val="Heading2"/>
@@ -1104,18 +1317,18 @@
           <wp:inline>
             <wp:extent cx="5334000" cy="3037416"/>
             <wp:effectExtent b="0" l="0" r="0" t="0"/>
-            <wp:docPr descr="Figure 1. Projected active workforce, 2025–2029, under the status-quo entrant scenario. Solid lines are the immediate-entry projection with shaded 95% uncertainty bands; dashed lines (hollow endpoints) are the transition-adjusted trajectory. URPS, urogynecology and reconstructive pelvic surgery; GO, gynecologic oncology." title="" id="21" name="Picture"/>
+            <wp:docPr descr="Figure 1. Projected active workforce, 2025–2029, under the status-quo entrant scenario. Solid lines are the immediate-entry projection with shaded 95% uncertainty bands; dashed lines (hollow endpoints) are the transition-adjusted trajectory. URPS, urogynecology and reconstructive pelvic surgery; GO, gynecologic oncology." title="" id="23" name="Picture"/>
             <a:graphic>
               <a:graphicData uri="http://schemas.openxmlformats.org/drawingml/2006/picture">
                 <pic:pic>
                   <pic:nvPicPr>
-                    <pic:cNvPr descr="/Users/tylermuffly/cliff/manuscript/manuscript_WORKFORCE_CLIFF_files/figures/figure1-1.png" id="22" name="Picture"/>
+                    <pic:cNvPr descr="/Users/tylermuffly/cliff/manuscript/manuscript_WORKFORCE_CLIFF_files/figures/figure1-1.png" id="24" name="Picture"/>
                     <pic:cNvPicPr>
                       <a:picLocks noChangeArrowheads="1" noChangeAspect="1"/>
                     </pic:cNvPicPr>
                   </pic:nvPicPr>
                   <pic:blipFill>
-                    <a:blip r:embed="rId20"/>
+                    <a:blip r:embed="rId22"/>
                     <a:stretch>
                       <a:fillRect/>
                     </a:stretch>
@@ -1168,8 +1381,8 @@
         <w:t xml:space="preserve">Under the status-quo scenario, the projected 2029 urogynecology workforce rose from the 2025 baseline of 1,306 to 1,466 (transition-adjusted) or 1,514 (immediate-entry), an increase of up to 16.0%; the completion-to-departure ratio was 5.4 (95% uncertainty interval 3.9 to 6.5). The gynecologic oncology comparator rose from 1,052 to 1,262–1,310, with a ratio of 7.1. Both cohorts exceeded the 2025 baseline under all three entrant scenarios (Table 2, Figure 1).</w:t>
       </w:r>
     </w:p>
-    <w:bookmarkEnd w:id="23"/>
-    <w:bookmarkStart w:id="27" w:name="sensitivity-analyses"/>
+    <w:bookmarkEnd w:id="25"/>
+    <w:bookmarkStart w:id="29" w:name="sensitivity-analyses"/>
     <w:p>
       <w:pPr>
         <w:pStyle w:val="Heading2"/>
@@ -1195,18 +1408,18 @@
           <wp:inline>
             <wp:extent cx="5334000" cy="3604054"/>
             <wp:effectExtent b="0" l="0" r="0" t="0"/>
-            <wp:docPr descr="Figure 2. Fellowship-completion-to-departure ratio across the primary analysis and selected sensitivity analyses. The dashed line marks one-for-one replacement; points to its right indicate completions exceeding departures. URPS, urogynecology and reconstructive pelvic surgery; GO, gynecologic oncology." title="" id="25" name="Picture"/>
+            <wp:docPr descr="Figure 2. Fellowship-completion-to-departure ratio across the primary analysis and selected sensitivity analyses. The dashed line marks one-for-one replacement; points to its right indicate completions exceeding departures. URPS, urogynecology and reconstructive pelvic surgery; GO, gynecologic oncology." title="" id="27" name="Picture"/>
             <a:graphic>
               <a:graphicData uri="http://schemas.openxmlformats.org/drawingml/2006/picture">
                 <pic:pic>
                   <pic:nvPicPr>
-                    <pic:cNvPr descr="/Users/tylermuffly/cliff/manuscript/manuscript_WORKFORCE_CLIFF_files/figures/figure2-1.png" id="26" name="Picture"/>
+                    <pic:cNvPr descr="/Users/tylermuffly/cliff/manuscript/manuscript_WORKFORCE_CLIFF_files/figures/figure2-1.png" id="28" name="Picture"/>
                     <pic:cNvPicPr>
                       <a:picLocks noChangeArrowheads="1" noChangeAspect="1"/>
                     </pic:cNvPicPr>
                   </pic:nvPicPr>
                   <pic:blipFill>
-                    <a:blip r:embed="rId24"/>
+                    <a:blip r:embed="rId26"/>
                     <a:stretch>
                       <a:fillRect/>
                     </a:stretch>
@@ -1251,8 +1464,8 @@
         <w:t xml:space="preserve">Fellowship-completion-to-departure ratio across the primary analysis and selected sensitivity analyses. The dashed line marks one-for-one replacement; points to its right indicate completions exceeding departures. URPS, urogynecology and reconstructive pelvic surgery; GO, gynecologic oncology.</w:t>
       </w:r>
     </w:p>
-    <w:bookmarkEnd w:id="27"/>
-    <w:bookmarkStart w:id="31" w:name="supply-relative-to-demographic-need"/>
+    <w:bookmarkEnd w:id="29"/>
+    <w:bookmarkStart w:id="33" w:name="supply-relative-to-demographic-need"/>
     <w:p>
       <w:pPr>
         <w:pStyle w:val="Heading2"/>
@@ -1278,18 +1491,18 @@
           <wp:inline>
             <wp:extent cx="5334000" cy="4741333"/>
             <wp:effectExtent b="0" l="0" r="0" t="0"/>
-            <wp:docPr descr="Figure 3. Projected urogynecology supply and demographic need, 2025–2050 (exploratory beyond 2029). Panel A indexes supply, productivity-adjusted capacity, and the two need measures to 2025 = 100; Panels B and C show urogynecologists per 100,000 women aged 65 years or older and women with a pelvic floor disorder per urogynecologist. URPS, urogynecology and reconstructive pelvic surgery." title="" id="29" name="Picture"/>
+            <wp:docPr descr="Figure 3. Projected urogynecology supply and demographic need, 2025–2050 (exploratory beyond 2029). Panel A indexes supply, productivity-adjusted capacity, and the two need measures to 2025 = 100; Panels B and C show urogynecologists per 100,000 women aged 65 years or older and women with a pelvic floor disorder per urogynecologist. URPS, urogynecology and reconstructive pelvic surgery." title="" id="31" name="Picture"/>
             <a:graphic>
               <a:graphicData uri="http://schemas.openxmlformats.org/drawingml/2006/picture">
                 <pic:pic>
                   <pic:nvPicPr>
-                    <pic:cNvPr descr="/Users/tylermuffly/cliff/manuscript/manuscript_WORKFORCE_CLIFF_files/figures/figure-integrated-supply-demand-1.png" id="30" name="Picture"/>
+                    <pic:cNvPr descr="/Users/tylermuffly/cliff/manuscript/manuscript_WORKFORCE_CLIFF_files/figures/figure-integrated-supply-demand-1.png" id="32" name="Picture"/>
                     <pic:cNvPicPr>
                       <a:picLocks noChangeArrowheads="1" noChangeAspect="1"/>
                     </pic:cNvPicPr>
                   </pic:nvPicPr>
                   <pic:blipFill>
-                    <a:blip r:embed="rId28"/>
+                    <a:blip r:embed="rId30"/>
                     <a:stretch>
                       <a:fillRect/>
                     </a:stretch>
@@ -1342,9 +1555,9 @@
         <w:t xml:space="preserve">An exploratory Medicare fee-for-service operative-workforce analysis could not distinguish true cessation of surgery from loss of Medicare visibility, so operative replacement was not estimated in the primary manuscript (Appendix S11).</w:t>
       </w:r>
     </w:p>
-    <w:bookmarkEnd w:id="31"/>
-    <w:bookmarkEnd w:id="32"/>
-    <w:bookmarkStart w:id="33" w:name="discussion"/>
+    <w:bookmarkEnd w:id="33"/>
+    <w:bookmarkEnd w:id="34"/>
+    <w:bookmarkStart w:id="35" w:name="discussion"/>
     <w:p>
       <w:pPr>
         <w:pStyle w:val="Heading1"/>
@@ -1404,7 +1617,7 @@
             <w:rStyle w:val="Hyperlink"/>
             <w:vertAlign w:val="superscript"/>
           </w:rPr>
-          <w:t xml:space="preserve">19</w:t>
+          <w:t xml:space="preserve">20</w:t>
         </w:r>
       </w:hyperlink>
     </w:p>
@@ -1421,7 +1634,7 @@
             <w:rStyle w:val="Hyperlink"/>
             <w:vertAlign w:val="superscript"/>
           </w:rPr>
-          <w:t xml:space="preserve">20</w:t>
+          <w:t xml:space="preserve">21</w:t>
         </w:r>
       </w:hyperlink>
       <w:r>
@@ -1471,8 +1684,8 @@
         <w:t xml:space="preserve">Recent fellowship completion appears sufficient to offset projected national urogynecology departures through 2029 under the study assumptions. In the exploratory extension, projected supply increased faster than population-based measures of pelvic floor disorder need through 2050. These findings should not be interpreted as evidence of workforce adequacy: the analysis does not measure utilization, wait times, geographic access, clinical full-time-equivalent effort, or operative capacity, and the departure endpoint remains provisional. Future workforce planning should pair validated physician-level departure data with all-payer utilization, operative volume, and geographic-access measures.</w:t>
       </w:r>
     </w:p>
-    <w:bookmarkEnd w:id="33"/>
-    <w:bookmarkStart w:id="73" w:name="references"/>
+    <w:bookmarkEnd w:id="35"/>
+    <w:bookmarkStart w:id="76" w:name="references"/>
     <w:p>
       <w:pPr>
         <w:pStyle w:val="Heading1"/>
@@ -1481,8 +1694,8 @@
         <w:t xml:space="preserve">References</w:t>
       </w:r>
     </w:p>
-    <w:bookmarkStart w:id="72" w:name="refs"/>
-    <w:bookmarkStart w:id="35" w:name="ref-nygaard2008"/>
+    <w:bookmarkStart w:id="75" w:name="refs"/>
+    <w:bookmarkStart w:id="37" w:name="ref-nygaard2008"/>
     <w:p>
       <w:pPr>
         <w:pStyle w:val="Bibliography"/>
@@ -1527,7 +1740,7 @@
       <w:r>
         <w:t xml:space="preserve">. 2008;300(11):1311-1316. doi:</w:t>
       </w:r>
-      <w:hyperlink r:id="rId34">
+      <w:hyperlink r:id="rId36">
         <w:r>
           <w:rPr>
             <w:rStyle w:val="Hyperlink"/>
@@ -1536,8 +1749,8 @@
         </w:r>
       </w:hyperlink>
     </w:p>
-    <w:bookmarkEnd w:id="35"/>
-    <w:bookmarkStart w:id="37" w:name="ref-brueseke2016"/>
+    <w:bookmarkEnd w:id="37"/>
+    <w:bookmarkStart w:id="39" w:name="ref-brueseke2016"/>
     <w:p>
       <w:pPr>
         <w:pStyle w:val="Bibliography"/>
@@ -1567,7 +1780,7 @@
       <w:r>
         <w:t xml:space="preserve">. 2016;22(5):385-389. doi:</w:t>
       </w:r>
-      <w:hyperlink r:id="rId36">
+      <w:hyperlink r:id="rId38">
         <w:r>
           <w:rPr>
             <w:rStyle w:val="Hyperlink"/>
@@ -1576,8 +1789,8 @@
         </w:r>
       </w:hyperlink>
     </w:p>
-    <w:bookmarkEnd w:id="37"/>
-    <w:bookmarkStart w:id="39" w:name="ref-etzioni2003"/>
+    <w:bookmarkEnd w:id="39"/>
+    <w:bookmarkStart w:id="41" w:name="ref-etzioni2003"/>
     <w:p>
       <w:pPr>
         <w:pStyle w:val="Bibliography"/>
@@ -1610,7 +1823,7 @@
       <w:r>
         <w:t xml:space="preserve">. 2003;238:170-177. doi:</w:t>
       </w:r>
-      <w:hyperlink r:id="rId38">
+      <w:hyperlink r:id="rId40">
         <w:r>
           <w:rPr>
             <w:rStyle w:val="Hyperlink"/>
@@ -1619,8 +1832,8 @@
         </w:r>
       </w:hyperlink>
     </w:p>
-    <w:bookmarkEnd w:id="39"/>
-    <w:bookmarkStart w:id="41" w:name="ref-edwards2014"/>
+    <w:bookmarkEnd w:id="41"/>
+    <w:bookmarkStart w:id="43" w:name="ref-edwards2014"/>
     <w:p>
       <w:pPr>
         <w:pStyle w:val="Bibliography"/>
@@ -1662,7 +1875,7 @@
       <w:r>
         <w:t xml:space="preserve">. 2014;148:7-12. doi:</w:t>
       </w:r>
-      <w:hyperlink r:id="rId40">
+      <w:hyperlink r:id="rId42">
         <w:r>
           <w:rPr>
             <w:rStyle w:val="Hyperlink"/>
@@ -1671,8 +1884,8 @@
         </w:r>
       </w:hyperlink>
     </w:p>
-    <w:bookmarkEnd w:id="41"/>
-    <w:bookmarkStart w:id="43" w:name="ref-fraher2013"/>
+    <w:bookmarkEnd w:id="43"/>
+    <w:bookmarkStart w:id="45" w:name="ref-fraher2013"/>
     <w:p>
       <w:pPr>
         <w:pStyle w:val="Bibliography"/>
@@ -1702,7 +1915,7 @@
       <w:r>
         <w:t xml:space="preserve">. 2013;257:867-872. doi:</w:t>
       </w:r>
-      <w:hyperlink r:id="rId42">
+      <w:hyperlink r:id="rId44">
         <w:r>
           <w:rPr>
             <w:rStyle w:val="Hyperlink"/>
@@ -1711,8 +1924,8 @@
         </w:r>
       </w:hyperlink>
     </w:p>
-    <w:bookmarkEnd w:id="43"/>
-    <w:bookmarkStart w:id="45" w:name="ref-leejt2024"/>
+    <w:bookmarkEnd w:id="45"/>
+    <w:bookmarkStart w:id="47" w:name="ref-leejt2024"/>
     <w:p>
       <w:pPr>
         <w:pStyle w:val="Bibliography"/>
@@ -1745,7 +1958,7 @@
       <w:r>
         <w:t xml:space="preserve">. 2024;22:25. doi:</w:t>
       </w:r>
-      <w:hyperlink r:id="rId44">
+      <w:hyperlink r:id="rId46">
         <w:r>
           <w:rPr>
             <w:rStyle w:val="Hyperlink"/>
@@ -1754,8 +1967,8 @@
         </w:r>
       </w:hyperlink>
     </w:p>
-    <w:bookmarkEnd w:id="45"/>
-    <w:bookmarkStart w:id="47" w:name="ref-rayburn2025complexities"/>
+    <w:bookmarkEnd w:id="47"/>
+    <w:bookmarkStart w:id="49" w:name="ref-rayburn2025complexities"/>
     <w:p>
       <w:pPr>
         <w:pStyle w:val="Bibliography"/>
@@ -1785,7 +1998,7 @@
       <w:r>
         <w:t xml:space="preserve">. 2025;52(4):599-614. doi:</w:t>
       </w:r>
-      <w:hyperlink r:id="rId46">
+      <w:hyperlink r:id="rId48">
         <w:r>
           <w:rPr>
             <w:rStyle w:val="Hyperlink"/>
@@ -1794,8 +2007,8 @@
         </w:r>
       </w:hyperlink>
     </w:p>
-    <w:bookmarkEnd w:id="47"/>
-    <w:bookmarkStart w:id="49" w:name="ref-shah2026"/>
+    <w:bookmarkEnd w:id="49"/>
+    <w:bookmarkStart w:id="51" w:name="ref-shah2026"/>
     <w:p>
       <w:pPr>
         <w:pStyle w:val="Bibliography"/>
@@ -1825,7 +2038,7 @@
       <w:r>
         <w:t xml:space="preserve">. 2026;287:58-66. doi:</w:t>
       </w:r>
-      <w:hyperlink r:id="rId48">
+      <w:hyperlink r:id="rId50">
         <w:r>
           <w:rPr>
             <w:rStyle w:val="Hyperlink"/>
@@ -1834,8 +2047,8 @@
         </w:r>
       </w:hyperlink>
     </w:p>
-    <w:bookmarkEnd w:id="49"/>
-    <w:bookmarkStart w:id="50" w:name="ref-nber2024"/>
+    <w:bookmarkEnd w:id="51"/>
+    <w:bookmarkStart w:id="52" w:name="ref-nber2024"/>
     <w:p>
       <w:pPr>
         <w:pStyle w:val="Bibliography"/>
@@ -1874,8 +2087,8 @@
         <w:t xml:space="preserve">. Published online 2024.</w:t>
       </w:r>
     </w:p>
-    <w:bookmarkEnd w:id="50"/>
-    <w:bookmarkStart w:id="52" w:name="ref-vonelm2007"/>
+    <w:bookmarkEnd w:id="52"/>
+    <w:bookmarkStart w:id="54" w:name="ref-vonelm2007"/>
     <w:p>
       <w:pPr>
         <w:pStyle w:val="Bibliography"/>
@@ -1968,7 +2181,7 @@
       <w:r>
         <w:t xml:space="preserve">. 2007;147:573-577. doi:</w:t>
       </w:r>
-      <w:hyperlink r:id="rId51">
+      <w:hyperlink r:id="rId53">
         <w:r>
           <w:rPr>
             <w:rStyle w:val="Hyperlink"/>
@@ -1977,8 +2190,8 @@
         </w:r>
       </w:hyperlink>
     </w:p>
-    <w:bookmarkEnd w:id="52"/>
-    <w:bookmarkStart w:id="54" w:name="ref-plaska2025"/>
+    <w:bookmarkEnd w:id="54"/>
+    <w:bookmarkStart w:id="56" w:name="ref-plaska2025"/>
     <w:p>
       <w:pPr>
         <w:pStyle w:val="Bibliography"/>
@@ -2008,7 +2221,7 @@
       <w:r>
         <w:t xml:space="preserve">. 2025;44(4):811-818. doi:</w:t>
       </w:r>
-      <w:hyperlink r:id="rId53">
+      <w:hyperlink r:id="rId55">
         <w:r>
           <w:rPr>
             <w:rStyle w:val="Hyperlink"/>
@@ -2017,8 +2230,8 @@
         </w:r>
       </w:hyperlink>
     </w:p>
-    <w:bookmarkEnd w:id="54"/>
-    <w:bookmarkStart w:id="55" w:name="ref-abms2024"/>
+    <w:bookmarkEnd w:id="56"/>
+    <w:bookmarkStart w:id="57" w:name="ref-abms2024"/>
     <w:p>
       <w:pPr>
         <w:pStyle w:val="Bibliography"/>
@@ -2036,8 +2249,8 @@
         <w:t xml:space="preserve">American Board of Medical Specialties. Number of board-certified physicians by specialty. Published online 2024.</w:t>
       </w:r>
     </w:p>
-    <w:bookmarkEnd w:id="55"/>
-    <w:bookmarkStart w:id="57" w:name="ref-rotenstein2025"/>
+    <w:bookmarkEnd w:id="57"/>
+    <w:bookmarkStart w:id="59" w:name="ref-rotenstein2025"/>
     <w:p>
       <w:pPr>
         <w:pStyle w:val="Bibliography"/>
@@ -2067,7 +2280,7 @@
       <w:r>
         <w:t xml:space="preserve">. 2025;178(12):1698-1708. doi:</w:t>
       </w:r>
-      <w:hyperlink r:id="rId56">
+      <w:hyperlink r:id="rId58">
         <w:r>
           <w:rPr>
             <w:rStyle w:val="Hyperlink"/>
@@ -2076,8 +2289,8 @@
         </w:r>
       </w:hyperlink>
     </w:p>
-    <w:bookmarkEnd w:id="57"/>
-    <w:bookmarkStart w:id="59" w:name="ref-elemosho2026"/>
+    <w:bookmarkEnd w:id="59"/>
+    <w:bookmarkStart w:id="61" w:name="ref-elemosho2026"/>
     <w:p>
       <w:pPr>
         <w:pStyle w:val="Bibliography"/>
@@ -2110,7 +2323,7 @@
       <w:r>
         <w:t xml:space="preserve">. Published online 2026. doi:</w:t>
       </w:r>
-      <w:hyperlink r:id="rId58">
+      <w:hyperlink r:id="rId60">
         <w:r>
           <w:rPr>
             <w:rStyle w:val="Hyperlink"/>
@@ -2119,8 +2332,8 @@
         </w:r>
       </w:hyperlink>
     </w:p>
-    <w:bookmarkEnd w:id="59"/>
-    <w:bookmarkStart w:id="61" w:name="ref-acgme_drb"/>
+    <w:bookmarkEnd w:id="61"/>
+    <w:bookmarkStart w:id="63" w:name="ref-acgme_drb"/>
     <w:p>
       <w:pPr>
         <w:pStyle w:val="Bibliography"/>
@@ -2153,7 +2366,7 @@
       <w:r>
         <w:t xml:space="preserve"> </w:t>
       </w:r>
-      <w:hyperlink r:id="rId60">
+      <w:hyperlink r:id="rId62">
         <w:r>
           <w:rPr>
             <w:rStyle w:val="Hyperlink"/>
@@ -2162,8 +2375,8 @@
         </w:r>
       </w:hyperlink>
     </w:p>
-    <w:bookmarkEnd w:id="61"/>
-    <w:bookmarkStart w:id="63" w:name="ref-humphries2026"/>
+    <w:bookmarkEnd w:id="63"/>
+    <w:bookmarkStart w:id="65" w:name="ref-humphries2026"/>
     <w:p>
       <w:pPr>
         <w:pStyle w:val="Bibliography"/>
@@ -2193,7 +2406,7 @@
       <w:r>
         <w:t xml:space="preserve">. 2026;3(1):e153. doi:</w:t>
       </w:r>
-      <w:hyperlink r:id="rId62">
+      <w:hyperlink r:id="rId64">
         <w:r>
           <w:rPr>
             <w:rStyle w:val="Hyperlink"/>
@@ -2202,8 +2415,8 @@
         </w:r>
       </w:hyperlink>
     </w:p>
-    <w:bookmarkEnd w:id="63"/>
-    <w:bookmarkStart w:id="65" w:name="ref-temkin2022fte"/>
+    <w:bookmarkEnd w:id="65"/>
+    <w:bookmarkStart w:id="67" w:name="ref-temkin2022fte"/>
     <w:p>
       <w:pPr>
         <w:pStyle w:val="Bibliography"/>
@@ -2245,7 +2458,7 @@
       <w:r>
         <w:t xml:space="preserve">. 2022;164(3):473-480. doi:</w:t>
       </w:r>
-      <w:hyperlink r:id="rId64">
+      <w:hyperlink r:id="rId66">
         <w:r>
           <w:rPr>
             <w:rStyle w:val="Hyperlink"/>
@@ -2254,14 +2467,33 @@
         </w:r>
       </w:hyperlink>
     </w:p>
-    <w:bookmarkEnd w:id="65"/>
-    <w:bookmarkStart w:id="67" w:name="ref-rcoreteam2023"/>
+    <w:bookmarkEnd w:id="67"/>
+    <w:bookmarkStart w:id="68" w:name="ref-muffly_urps_explorer"/>
     <w:p>
       <w:pPr>
         <w:pStyle w:val="Bibliography"/>
       </w:pPr>
       <w:r>
         <w:t xml:space="preserve">18.</w:t>
+      </w:r>
+      <w:r>
+        <w:t xml:space="preserve"> </w:t>
+      </w:r>
+      <w:r>
+        <w:t xml:space="preserve">	</w:t>
+      </w:r>
+      <w:r>
+        <w:t xml:space="preserve">Muffly T. Urogynecology workforce supply-and-demand explorer: An interactive web application. Published online 2026.</w:t>
+      </w:r>
+    </w:p>
+    <w:bookmarkEnd w:id="68"/>
+    <w:bookmarkStart w:id="70" w:name="ref-rcoreteam2023"/>
+    <w:p>
+      <w:pPr>
+        <w:pStyle w:val="Bibliography"/>
+      </w:pPr>
+      <w:r>
+        <w:t xml:space="preserve">19.</w:t>
       </w:r>
       <w:r>
         <w:t xml:space="preserve"> </w:t>
@@ -2288,7 +2520,7 @@
       <w:r>
         <w:t xml:space="preserve"> </w:t>
       </w:r>
-      <w:hyperlink r:id="rId66">
+      <w:hyperlink r:id="rId69">
         <w:r>
           <w:rPr>
             <w:rStyle w:val="Hyperlink"/>
@@ -2297,14 +2529,14 @@
         </w:r>
       </w:hyperlink>
     </w:p>
-    <w:bookmarkEnd w:id="67"/>
-    <w:bookmarkStart w:id="69" w:name="ref-holtzman2025"/>
+    <w:bookmarkEnd w:id="70"/>
+    <w:bookmarkStart w:id="72" w:name="ref-holtzman2025"/>
     <w:p>
       <w:pPr>
         <w:pStyle w:val="Bibliography"/>
       </w:pPr>
       <w:r>
-        <w:t xml:space="preserve">19.</w:t>
+        <w:t xml:space="preserve">20.</w:t>
       </w:r>
       <w:r>
         <w:t xml:space="preserve"> </w:t>
@@ -2337,7 +2569,7 @@
       <w:r>
         <w:t xml:space="preserve">. 2025;202:162-166. doi:</w:t>
       </w:r>
-      <w:hyperlink r:id="rId68">
+      <w:hyperlink r:id="rId71">
         <w:r>
           <w:rPr>
             <w:rStyle w:val="Hyperlink"/>
@@ -2346,14 +2578,14 @@
         </w:r>
       </w:hyperlink>
     </w:p>
-    <w:bookmarkEnd w:id="69"/>
-    <w:bookmarkStart w:id="71" w:name="ref-chen2026geographic"/>
+    <w:bookmarkEnd w:id="72"/>
+    <w:bookmarkStart w:id="74" w:name="ref-chen2026geographic"/>
     <w:p>
       <w:pPr>
         <w:pStyle w:val="Bibliography"/>
       </w:pPr>
       <w:r>
-        <w:t xml:space="preserve">20.</w:t>
+        <w:t xml:space="preserve">21.</w:t>
       </w:r>
       <w:r>
         <w:t xml:space="preserve"> </w:t>
@@ -2377,7 +2609,7 @@
       <w:r>
         <w:t xml:space="preserve">. 2026;147(3):422-424. doi:</w:t>
       </w:r>
-      <w:hyperlink r:id="rId70">
+      <w:hyperlink r:id="rId73">
         <w:r>
           <w:rPr>
             <w:rStyle w:val="Hyperlink"/>
@@ -2386,9 +2618,9 @@
         </w:r>
       </w:hyperlink>
     </w:p>
-    <w:bookmarkEnd w:id="71"/>
-    <w:bookmarkEnd w:id="72"/>
-    <w:bookmarkEnd w:id="73"/>
+    <w:bookmarkEnd w:id="74"/>
+    <w:bookmarkEnd w:id="75"/>
+    <w:bookmarkEnd w:id="76"/>
     <w:sectPr>
       <w:footerReference r:id="rIdGJFooter" w:type="default"/>
       <w:footnotePr>

</xml_diff>